<commit_message>
Pruebas reducidas a las 10 que pide la rúbrica, con patrón AAA comentado; documentos actualizados
Co-Authored-By: Claude Opus 5.5 <noreply@anthropic.com>
Claude-Session: https://claude.ai/code/session_01LaPXtaCfna2Tf3AsQieRe8
</commit_message>
<xml_diff>
--- a/docs/ERS_ForeverInk_v2.docx
+++ b/docs/ERS_ForeverInk_v2.docx
@@ -12067,7 +12067,7 @@
         <w:rPr>
           <w:rFonts w:ascii="Arial" w:cs="Arial" w:eastAsia="Arial" w:hAnsi="Arial"/>
         </w:rPr>
-        <w:t xml:space="preserve">Las pruebas unitarias (132 al cierre de esta versión) protegen el código frente a regresiones.</w:t>
+        <w:t xml:space="preserve">Las 10 pruebas unitarias protegen las reglas críticas del código frente a regresiones.</w:t>
       </w:r>
     </w:p>
     <w:p>
@@ -12211,7 +12211,7 @@
         <w:rPr>
           <w:rFonts w:ascii="Arial" w:cs="Arial" w:eastAsia="Arial" w:hAnsi="Arial"/>
         </w:rPr>
-        <w:t xml:space="preserve">La siguiente matriz relaciona los requisitos con las suites de pruebas Jasmine que los verifican (carpeta </w:t>
+        <w:t xml:space="preserve">La siguiente matriz relaciona los requisitos con las 10 pruebas Jasmine que los verifican (carpeta </w:t>
       </w:r>
       <w:r>
         <w:rPr>
@@ -12313,7 +12313,7 @@
                 <w:sz w:val="17"/>
                 <w:szCs w:val="17"/>
               </w:rPr>
-              <w:t xml:space="preserve">Suite de pruebas</w:t>
+              <w:t xml:space="preserve">Prueba (archivo)</w:t>
             </w:r>
           </w:p>
         </w:tc>
@@ -12381,7 +12381,7 @@
                 <w:sz w:val="17"/>
                 <w:szCs w:val="17"/>
               </w:rPr>
-              <w:t xml:space="preserve">R.1, R.4, R.5</w:t>
+              <w:t xml:space="preserve">R.2</w:t>
             </w:r>
           </w:p>
         </w:tc>
@@ -12407,20 +12407,28 @@
             </w:pPr>
             <w:r>
               <w:rPr>
+                <w:rFonts w:ascii="Arial" w:cs="Arial" w:eastAsia="Arial" w:hAnsi="Arial"/>
+                <w:sz w:val="17"/>
+                <w:szCs w:val="17"/>
+              </w:rPr>
+              <w:t xml:space="preserve">5 · ListaProductos vacía (</w:t>
+            </w:r>
+            <w:r>
+              <w:rPr>
                 <w:rFonts w:ascii="Consolas" w:cs="Consolas" w:eastAsia="Consolas" w:hAnsi="Consolas"/>
                 <w:sz w:val="17"/>
                 <w:szCs w:val="17"/>
                 <w:shd w:fill="EFEFEF" w:val="clear"/>
               </w:rPr>
-              <w:t xml:space="preserve">paginas.spec</w:t>
-            </w:r>
-            <w:r>
-              <w:rPr>
-                <w:rFonts w:ascii="Arial" w:cs="Arial" w:eastAsia="Arial" w:hAnsi="Arial"/>
-                <w:sz w:val="17"/>
-                <w:szCs w:val="17"/>
-              </w:rPr>
-              <w:t xml:space="preserve"> – Navegación general</w:t>
+              <w:t xml:space="preserve">componentes.spec</w:t>
+            </w:r>
+            <w:r>
+              <w:rPr>
+                <w:rFonts w:ascii="Arial" w:cs="Arial" w:eastAsia="Arial" w:hAnsi="Arial"/>
+                <w:sz w:val="17"/>
+                <w:szCs w:val="17"/>
+              </w:rPr>
+              <w:t xml:space="preserve">)</w:t>
             </w:r>
           </w:p>
         </w:tc>
@@ -12450,7 +12458,7 @@
                 <w:sz w:val="17"/>
                 <w:szCs w:val="17"/>
               </w:rPr>
-              <w:t xml:space="preserve">Home, 404, detalle de estilo, ofertas, detalle de diseño, búsqueda por URL.</w:t>
+              <w:t xml:space="preserve">Con lista vacía se muestra un mensaje en vez de tarjetas.</w:t>
             </w:r>
           </w:p>
         </w:tc>
@@ -12486,7 +12494,7 @@
                 <w:sz w:val="17"/>
                 <w:szCs w:val="17"/>
               </w:rPr>
-              <w:t xml:space="preserve">R.2, R.3</w:t>
+              <w:t xml:space="preserve">R.3</w:t>
             </w:r>
           </w:p>
         </w:tc>
@@ -12513,30 +12521,29 @@
             </w:pPr>
             <w:r>
               <w:rPr>
+                <w:rFonts w:ascii="Arial" w:cs="Arial" w:eastAsia="Arial" w:hAnsi="Arial"/>
+                <w:sz w:val="17"/>
+                <w:szCs w:val="17"/>
+              </w:rPr>
+              <w:t xml:space="preserve">6 · Galería (</w:t>
+            </w:r>
+            <w:r>
+              <w:rPr>
                 <w:rFonts w:ascii="Consolas" w:cs="Consolas" w:eastAsia="Consolas" w:hAnsi="Consolas"/>
                 <w:sz w:val="17"/>
                 <w:szCs w:val="17"/>
                 <w:shd w:fill="EFEFEF" w:val="clear"/>
               </w:rPr>
-              <w:t xml:space="preserve">servicios.spec</w:t>
-            </w:r>
-            <w:r>
-              <w:rPr>
-                <w:rFonts w:ascii="Arial" w:cs="Arial" w:eastAsia="Arial" w:hAnsi="Arial"/>
-                <w:sz w:val="17"/>
-                <w:szCs w:val="17"/>
-              </w:rPr>
-              <w:t xml:space="preserve"> – Productos; </w:t>
-            </w:r>
-            <w:r>
-              <w:rPr>
-                <w:rFonts w:ascii="Consolas" w:cs="Consolas" w:eastAsia="Consolas" w:hAnsi="Consolas"/>
-                <w:sz w:val="17"/>
-                <w:szCs w:val="17"/>
-                <w:shd w:fill="EFEFEF" w:val="clear"/>
-              </w:rPr>
               <w:t xml:space="preserve">componentes.spec</w:t>
             </w:r>
+            <w:r>
+              <w:rPr>
+                <w:rFonts w:ascii="Arial" w:cs="Arial" w:eastAsia="Arial" w:hAnsi="Arial"/>
+                <w:sz w:val="17"/>
+                <w:szCs w:val="17"/>
+              </w:rPr>
+              <w:t xml:space="preserve">)</w:t>
+            </w:r>
           </w:p>
         </w:tc>
         <w:tc>
@@ -12566,7 +12573,7 @@
                 <w:sz w:val="17"/>
                 <w:szCs w:val="17"/>
               </w:rPr>
-              <w:t xml:space="preserve">Búsqueda sin tildes, filtros, orden por precio; tarjeta con precio, oferta, cupos y evento de clic; lista y mensaje vacío.</w:t>
+              <w:t xml:space="preserve">Al hacer clic en una miniatura cambia la imagen principal.</w:t>
             </w:r>
           </w:p>
         </w:tc>
@@ -12627,20 +12634,28 @@
             </w:pPr>
             <w:r>
               <w:rPr>
+                <w:rFonts w:ascii="Arial" w:cs="Arial" w:eastAsia="Arial" w:hAnsi="Arial"/>
+                <w:sz w:val="17"/>
+                <w:szCs w:val="17"/>
+              </w:rPr>
+              <w:t xml:space="preserve">2 · Máximo 5 unidades (</w:t>
+            </w:r>
+            <w:r>
+              <w:rPr>
                 <w:rFonts w:ascii="Consolas" w:cs="Consolas" w:eastAsia="Consolas" w:hAnsi="Consolas"/>
                 <w:sz w:val="17"/>
                 <w:szCs w:val="17"/>
                 <w:shd w:fill="EFEFEF" w:val="clear"/>
               </w:rPr>
-              <w:t xml:space="preserve">servicios.spec</w:t>
-            </w:r>
-            <w:r>
-              <w:rPr>
-                <w:rFonts w:ascii="Arial" w:cs="Arial" w:eastAsia="Arial" w:hAnsi="Arial"/>
-                <w:sz w:val="17"/>
-                <w:szCs w:val="17"/>
-              </w:rPr>
-              <w:t xml:space="preserve"> – Reglas del carrito; </w:t>
+              <w:t xml:space="preserve">logica.spec</w:t>
+            </w:r>
+            <w:r>
+              <w:rPr>
+                <w:rFonts w:ascii="Arial" w:cs="Arial" w:eastAsia="Arial" w:hAnsi="Arial"/>
+                <w:sz w:val="17"/>
+                <w:szCs w:val="17"/>
+              </w:rPr>
+              <w:t xml:space="preserve">); 4 · TarjetaProducto (</w:t>
             </w:r>
             <w:r>
               <w:rPr>
@@ -12649,15 +12664,15 @@
                 <w:szCs w:val="17"/>
                 <w:shd w:fill="EFEFEF" w:val="clear"/>
               </w:rPr>
-              <w:t xml:space="preserve">paginas.spec</w:t>
-            </w:r>
-            <w:r>
-              <w:rPr>
-                <w:rFonts w:ascii="Arial" w:cs="Arial" w:eastAsia="Arial" w:hAnsi="Arial"/>
-                <w:sz w:val="17"/>
-                <w:szCs w:val="17"/>
-              </w:rPr>
-              <w:t xml:space="preserve"> – Carrito</w:t>
+              <w:t xml:space="preserve">componentes.spec</w:t>
+            </w:r>
+            <w:r>
+              <w:rPr>
+                <w:rFonts w:ascii="Arial" w:cs="Arial" w:eastAsia="Arial" w:hAnsi="Arial"/>
+                <w:sz w:val="17"/>
+                <w:szCs w:val="17"/>
+              </w:rPr>
+              <w:t xml:space="preserve">)</w:t>
             </w:r>
           </w:p>
         </w:tc>
@@ -12687,7 +12702,7 @@
                 <w:sz w:val="17"/>
                 <w:szCs w:val="17"/>
               </w:rPr>
-              <w:t xml:space="preserve">Máximo 5, cupos, mínimo 1, totales; añadir desde el detalle; carrito vacío; cambiar cantidad.</w:t>
+              <w:t xml:space="preserve">La regla de máximo por diseño y que el botón Añadir avise al padre con el producto.</w:t>
             </w:r>
           </w:p>
         </w:tc>
@@ -12723,7 +12738,7 @@
                 <w:sz w:val="17"/>
                 <w:szCs w:val="17"/>
               </w:rPr>
-              <w:t xml:space="preserve">R.7, R.8</w:t>
+              <w:t xml:space="preserve">R.7</w:t>
             </w:r>
           </w:p>
         </w:tc>
@@ -12750,37 +12765,28 @@
             </w:pPr>
             <w:r>
               <w:rPr>
+                <w:rFonts w:ascii="Arial" w:cs="Arial" w:eastAsia="Arial" w:hAnsi="Arial"/>
+                <w:sz w:val="17"/>
+                <w:szCs w:val="17"/>
+              </w:rPr>
+              <w:t xml:space="preserve">10 · Hora ocupada solo si está pagada (</w:t>
+            </w:r>
+            <w:r>
+              <w:rPr>
                 <w:rFonts w:ascii="Consolas" w:cs="Consolas" w:eastAsia="Consolas" w:hAnsi="Consolas"/>
                 <w:sz w:val="17"/>
                 <w:szCs w:val="17"/>
                 <w:shd w:fill="EFEFEF" w:val="clear"/>
               </w:rPr>
-              <w:t xml:space="preserve">paginas.spec</w:t>
-            </w:r>
-            <w:r>
-              <w:rPr>
-                <w:rFonts w:ascii="Arial" w:cs="Arial" w:eastAsia="Arial" w:hAnsi="Arial"/>
-                <w:sz w:val="17"/>
-                <w:szCs w:val="17"/>
-              </w:rPr>
-              <w:t xml:space="preserve"> – Checkout con pasarela simulada; </w:t>
-            </w:r>
-            <w:r>
-              <w:rPr>
-                <w:rFonts w:ascii="Consolas" w:cs="Consolas" w:eastAsia="Consolas" w:hAnsi="Consolas"/>
-                <w:sz w:val="17"/>
-                <w:szCs w:val="17"/>
-                <w:shd w:fill="EFEFEF" w:val="clear"/>
-              </w:rPr>
-              <w:t xml:space="preserve">servicios.spec</w:t>
-            </w:r>
-            <w:r>
-              <w:rPr>
-                <w:rFonts w:ascii="Arial" w:cs="Arial" w:eastAsia="Arial" w:hAnsi="Arial"/>
-                <w:sz w:val="17"/>
-                <w:szCs w:val="17"/>
-              </w:rPr>
-              <w:t xml:space="preserve"> – Órdenes y agenda</w:t>
+              <w:t xml:space="preserve">logica.spec</w:t>
+            </w:r>
+            <w:r>
+              <w:rPr>
+                <w:rFonts w:ascii="Arial" w:cs="Arial" w:eastAsia="Arial" w:hAnsi="Arial"/>
+                <w:sz w:val="17"/>
+                <w:szCs w:val="17"/>
+              </w:rPr>
+              <w:t xml:space="preserve">)</w:t>
             </w:r>
           </w:p>
         </w:tc>
@@ -12811,7 +12817,7 @@
                 <w:sz w:val="17"/>
                 <w:szCs w:val="17"/>
               </w:rPr>
-              <w:t xml:space="preserve">Pago aprobado y rechazado con mock (spyOn), reintento con la misma orden, errores de formulario, horario ocupado.</w:t>
+              <w:t xml:space="preserve">Una orden pendiente deja la hora libre; al pagarla se ocupa.</w:t>
             </w:r>
           </w:p>
         </w:tc>
@@ -12846,7 +12852,7 @@
                 <w:sz w:val="17"/>
                 <w:szCs w:val="17"/>
               </w:rPr>
-              <w:t xml:space="preserve">R.9</w:t>
+              <w:t xml:space="preserve">R.8</w:t>
             </w:r>
           </w:p>
         </w:tc>
@@ -12872,20 +12878,28 @@
             </w:pPr>
             <w:r>
               <w:rPr>
+                <w:rFonts w:ascii="Arial" w:cs="Arial" w:eastAsia="Arial" w:hAnsi="Arial"/>
+                <w:sz w:val="17"/>
+                <w:szCs w:val="17"/>
+              </w:rPr>
+              <w:t xml:space="preserve">9 · Pago rechazado con mock (</w:t>
+            </w:r>
+            <w:r>
+              <w:rPr>
                 <w:rFonts w:ascii="Consolas" w:cs="Consolas" w:eastAsia="Consolas" w:hAnsi="Consolas"/>
                 <w:sz w:val="17"/>
                 <w:szCs w:val="17"/>
                 <w:shd w:fill="EFEFEF" w:val="clear"/>
               </w:rPr>
-              <w:t xml:space="preserve">extras.spec</w:t>
-            </w:r>
-            <w:r>
-              <w:rPr>
-                <w:rFonts w:ascii="Arial" w:cs="Arial" w:eastAsia="Arial" w:hAnsi="Arial"/>
-                <w:sz w:val="17"/>
-                <w:szCs w:val="17"/>
-              </w:rPr>
-              <w:t xml:space="preserve"> – Sesión y utilidades</w:t>
+              <w:t xml:space="preserve">checkout.spec</w:t>
+            </w:r>
+            <w:r>
+              <w:rPr>
+                <w:rFonts w:ascii="Arial" w:cs="Arial" w:eastAsia="Arial" w:hAnsi="Arial"/>
+                <w:sz w:val="17"/>
+                <w:szCs w:val="17"/>
+              </w:rPr>
+              <w:t xml:space="preserve">)</w:t>
             </w:r>
           </w:p>
         </w:tc>
@@ -12915,7 +12929,7 @@
                 <w:sz w:val="17"/>
                 <w:szCs w:val="17"/>
               </w:rPr>
-              <w:t xml:space="preserve">Enlace mailto de la boleta con el número de orden.</w:t>
+              <w:t xml:space="preserve">Orden “Pago rechazado”, stock intacto y carrito conservado.</w:t>
             </w:r>
           </w:p>
         </w:tc>
@@ -12951,7 +12965,7 @@
                 <w:sz w:val="17"/>
                 <w:szCs w:val="17"/>
               </w:rPr>
-              <w:t xml:space="preserve">R.10, R.11, R.12</w:t>
+              <w:t xml:space="preserve">R.10</w:t>
             </w:r>
           </w:p>
         </w:tc>
@@ -12978,37 +12992,28 @@
             </w:pPr>
             <w:r>
               <w:rPr>
+                <w:rFonts w:ascii="Arial" w:cs="Arial" w:eastAsia="Arial" w:hAnsi="Arial"/>
+                <w:sz w:val="17"/>
+                <w:szCs w:val="17"/>
+              </w:rPr>
+              <w:t xml:space="preserve">1 · RUN inválido (</w:t>
+            </w:r>
+            <w:r>
+              <w:rPr>
                 <w:rFonts w:ascii="Consolas" w:cs="Consolas" w:eastAsia="Consolas" w:hAnsi="Consolas"/>
                 <w:sz w:val="17"/>
                 <w:szCs w:val="17"/>
                 <w:shd w:fill="EFEFEF" w:val="clear"/>
               </w:rPr>
-              <w:t xml:space="preserve">validaciones.spec</w:t>
-            </w:r>
-            <w:r>
-              <w:rPr>
-                <w:rFonts w:ascii="Arial" w:cs="Arial" w:eastAsia="Arial" w:hAnsi="Arial"/>
-                <w:sz w:val="17"/>
-                <w:szCs w:val="17"/>
-              </w:rPr>
-              <w:t xml:space="preserve">; </w:t>
-            </w:r>
-            <w:r>
-              <w:rPr>
-                <w:rFonts w:ascii="Consolas" w:cs="Consolas" w:eastAsia="Consolas" w:hAnsi="Consolas"/>
-                <w:sz w:val="17"/>
-                <w:szCs w:val="17"/>
-                <w:shd w:fill="EFEFEF" w:val="clear"/>
-              </w:rPr>
-              <w:t xml:space="preserve">paginas.spec</w:t>
-            </w:r>
-            <w:r>
-              <w:rPr>
-                <w:rFonts w:ascii="Arial" w:cs="Arial" w:eastAsia="Arial" w:hAnsi="Arial"/>
-                <w:sz w:val="17"/>
-                <w:szCs w:val="17"/>
-              </w:rPr>
-              <w:t xml:space="preserve"> – Inicio de sesión y registro; Perfil</w:t>
+              <w:t xml:space="preserve">logica.spec</w:t>
+            </w:r>
+            <w:r>
+              <w:rPr>
+                <w:rFonts w:ascii="Arial" w:cs="Arial" w:eastAsia="Arial" w:hAnsi="Arial"/>
+                <w:sz w:val="17"/>
+                <w:szCs w:val="17"/>
+              </w:rPr>
+              <w:t xml:space="preserve">)</w:t>
             </w:r>
           </w:p>
         </w:tc>
@@ -13039,7 +13044,7 @@
                 <w:sz w:val="17"/>
                 <w:szCs w:val="17"/>
               </w:rPr>
-              <w:t xml:space="preserve">RUN, correo, contraseña, teléfono; login correcto e incorrecto; registro; edición de perfil.</w:t>
+              <w:t xml:space="preserve">El RUN con dígito verificador incorrecto se rechaza.</w:t>
             </w:r>
           </w:p>
         </w:tc>
@@ -13074,7 +13079,7 @@
                 <w:sz w:val="17"/>
                 <w:szCs w:val="17"/>
               </w:rPr>
-              <w:t xml:space="preserve">R.13, R.14</w:t>
+              <w:t xml:space="preserve">R.11</w:t>
             </w:r>
           </w:p>
         </w:tc>
@@ -13100,37 +13105,28 @@
             </w:pPr>
             <w:r>
               <w:rPr>
+                <w:rFonts w:ascii="Arial" w:cs="Arial" w:eastAsia="Arial" w:hAnsi="Arial"/>
+                <w:sz w:val="17"/>
+                <w:szCs w:val="17"/>
+              </w:rPr>
+              <w:t xml:space="preserve">7 · FormularioLogin (</w:t>
+            </w:r>
+            <w:r>
+              <w:rPr>
                 <w:rFonts w:ascii="Consolas" w:cs="Consolas" w:eastAsia="Consolas" w:hAnsi="Consolas"/>
                 <w:sz w:val="17"/>
                 <w:szCs w:val="17"/>
                 <w:shd w:fill="EFEFEF" w:val="clear"/>
               </w:rPr>
-              <w:t xml:space="preserve">paginas.spec</w:t>
-            </w:r>
-            <w:r>
-              <w:rPr>
-                <w:rFonts w:ascii="Arial" w:cs="Arial" w:eastAsia="Arial" w:hAnsi="Arial"/>
-                <w:sz w:val="17"/>
-                <w:szCs w:val="17"/>
-              </w:rPr>
-              <w:t xml:space="preserve">; </w:t>
-            </w:r>
-            <w:r>
-              <w:rPr>
-                <w:rFonts w:ascii="Consolas" w:cs="Consolas" w:eastAsia="Consolas" w:hAnsi="Consolas"/>
-                <w:sz w:val="17"/>
-                <w:szCs w:val="17"/>
-                <w:shd w:fill="EFEFEF" w:val="clear"/>
-              </w:rPr>
-              <w:t xml:space="preserve">extras.spec</w:t>
-            </w:r>
-            <w:r>
-              <w:rPr>
-                <w:rFonts w:ascii="Arial" w:cs="Arial" w:eastAsia="Arial" w:hAnsi="Arial"/>
-                <w:sz w:val="17"/>
-                <w:szCs w:val="17"/>
-              </w:rPr>
-              <w:t xml:space="preserve"> – Páginas informativas</w:t>
+              <w:t xml:space="preserve">componentes.spec</w:t>
+            </w:r>
+            <w:r>
+              <w:rPr>
+                <w:rFonts w:ascii="Arial" w:cs="Arial" w:eastAsia="Arial" w:hAnsi="Arial"/>
+                <w:sz w:val="17"/>
+                <w:szCs w:val="17"/>
+              </w:rPr>
+              <w:t xml:space="preserve">)</w:t>
             </w:r>
           </w:p>
         </w:tc>
@@ -13160,7 +13156,7 @@
                 <w:sz w:val="17"/>
                 <w:szCs w:val="17"/>
               </w:rPr>
-              <w:t xml:space="preserve">Contacto guarda el mensaje; blog y detalle de publicación.</w:t>
+              <w:t xml:space="preserve">Errores de validación en tiempo real al escribir.</w:t>
             </w:r>
           </w:p>
         </w:tc>
@@ -13196,7 +13192,7 @@
                 <w:sz w:val="17"/>
                 <w:szCs w:val="17"/>
               </w:rPr>
-              <w:t xml:space="preserve">R.15 a R.20</w:t>
+              <w:t xml:space="preserve">R.20</w:t>
             </w:r>
           </w:p>
         </w:tc>
@@ -13223,37 +13219,28 @@
             </w:pPr>
             <w:r>
               <w:rPr>
+                <w:rFonts w:ascii="Arial" w:cs="Arial" w:eastAsia="Arial" w:hAnsi="Arial"/>
+                <w:sz w:val="17"/>
+                <w:szCs w:val="17"/>
+              </w:rPr>
+              <w:t xml:space="preserve">3 · Stock crítico (</w:t>
+            </w:r>
+            <w:r>
+              <w:rPr>
                 <w:rFonts w:ascii="Consolas" w:cs="Consolas" w:eastAsia="Consolas" w:hAnsi="Consolas"/>
                 <w:sz w:val="17"/>
                 <w:szCs w:val="17"/>
                 <w:shd w:fill="EFEFEF" w:val="clear"/>
               </w:rPr>
-              <w:t xml:space="preserve">paginas.spec</w:t>
-            </w:r>
-            <w:r>
-              <w:rPr>
-                <w:rFonts w:ascii="Arial" w:cs="Arial" w:eastAsia="Arial" w:hAnsi="Arial"/>
-                <w:sz w:val="17"/>
-                <w:szCs w:val="17"/>
-              </w:rPr>
-              <w:t xml:space="preserve"> – Panel de administración; </w:t>
-            </w:r>
-            <w:r>
-              <w:rPr>
-                <w:rFonts w:ascii="Consolas" w:cs="Consolas" w:eastAsia="Consolas" w:hAnsi="Consolas"/>
-                <w:sz w:val="17"/>
-                <w:szCs w:val="17"/>
-                <w:shd w:fill="EFEFEF" w:val="clear"/>
-              </w:rPr>
-              <w:t xml:space="preserve">extras.spec</w:t>
-            </w:r>
-            <w:r>
-              <w:rPr>
-                <w:rFonts w:ascii="Arial" w:cs="Arial" w:eastAsia="Arial" w:hAnsi="Arial"/>
-                <w:sz w:val="17"/>
-                <w:szCs w:val="17"/>
-              </w:rPr>
-              <w:t xml:space="preserve"> – Panel</w:t>
+              <w:t xml:space="preserve">logica.spec</w:t>
+            </w:r>
+            <w:r>
+              <w:rPr>
+                <w:rFonts w:ascii="Arial" w:cs="Arial" w:eastAsia="Arial" w:hAnsi="Arial"/>
+                <w:sz w:val="17"/>
+                <w:szCs w:val="17"/>
+              </w:rPr>
+              <w:t xml:space="preserve">)</w:t>
             </w:r>
           </w:p>
         </w:tc>
@@ -13284,7 +13271,7 @@
                 <w:sz w:val="17"/>
                 <w:szCs w:val="17"/>
               </w:rPr>
-              <w:t xml:space="preserve">Eliminar con modal, crear diseño y categoría, validación de oferta, permisos del vendedor, alerta de stock crítico, reportes, historial.</w:t>
+              <w:t xml:space="preserve">Detección con stock igual, menor y mayor que el crítico.</w:t>
             </w:r>
           </w:p>
         </w:tc>
@@ -13345,6 +13332,14 @@
             </w:pPr>
             <w:r>
               <w:rPr>
+                <w:rFonts w:ascii="Arial" w:cs="Arial" w:eastAsia="Arial" w:hAnsi="Arial"/>
+                <w:sz w:val="17"/>
+                <w:szCs w:val="17"/>
+              </w:rPr>
+              <w:t xml:space="preserve">8 · RutaProtegida (</w:t>
+            </w:r>
+            <w:r>
+              <w:rPr>
                 <w:rFonts w:ascii="Consolas" w:cs="Consolas" w:eastAsia="Consolas" w:hAnsi="Consolas"/>
                 <w:sz w:val="17"/>
                 <w:szCs w:val="17"/>
@@ -13358,7 +13353,7 @@
                 <w:sz w:val="17"/>
                 <w:szCs w:val="17"/>
               </w:rPr>
-              <w:t xml:space="preserve"> – RutaProtegida</w:t>
+              <w:t xml:space="preserve">)</w:t>
             </w:r>
           </w:p>
         </w:tc>
@@ -13388,7 +13383,7 @@
                 <w:sz w:val="17"/>
                 <w:szCs w:val="17"/>
               </w:rPr>
-              <w:t xml:space="preserve">Sin sesión → login; rol sin permiso → inicio; rol correcto → contenido.</w:t>
+              <w:t xml:space="preserve">Sin sesión se redirige al login.</w:t>
             </w:r>
           </w:p>
         </w:tc>
@@ -13424,7 +13419,7 @@
                 <w:sz w:val="17"/>
                 <w:szCs w:val="17"/>
               </w:rPr>
-              <w:t xml:space="preserve">R.22</w:t>
+              <w:t xml:space="preserve">R.23</w:t>
             </w:r>
           </w:p>
         </w:tc>
@@ -13451,12 +13446,11 @@
             </w:pPr>
             <w:r>
               <w:rPr>
-                <w:rFonts w:ascii="Consolas" w:cs="Consolas" w:eastAsia="Consolas" w:hAnsi="Consolas"/>
-                <w:sz w:val="17"/>
-                <w:szCs w:val="17"/>
-                <w:shd w:fill="EFEFEF" w:val="clear"/>
-              </w:rPr>
-              <w:t xml:space="preserve">db.spec</w:t>
+                <w:rFonts w:ascii="Arial" w:cs="Arial" w:eastAsia="Arial" w:hAnsi="Arial"/>
+                <w:sz w:val="17"/>
+                <w:szCs w:val="17"/>
+              </w:rPr>
+              <w:t xml:space="preserve">Las 10 pruebas</w:t>
             </w:r>
           </w:p>
         </w:tc>
@@ -13487,107 +13481,23 @@
                 <w:sz w:val="17"/>
                 <w:szCs w:val="17"/>
               </w:rPr>
-              <w:t xml:space="preserve">Crear, listar, actualizar y eliminar registros persistidos.</w:t>
-            </w:r>
-          </w:p>
-        </w:tc>
-      </w:tr>
-      <w:tr>
-        <w:trPr>
-          <w:cantSplit/>
-        </w:trPr>
-        <w:tc>
-          <w:tcPr>
-            <w:tcW w:type="dxa" w:w="1500"/>
-            <w:tcBorders>
-              <w:top w:val="single" w:color="BFBFBF" w:sz="4"/>
-              <w:left w:val="single" w:color="BFBFBF" w:sz="4"/>
-              <w:bottom w:val="single" w:color="BFBFBF" w:sz="4"/>
-              <w:right w:val="single" w:color="BFBFBF" w:sz="4"/>
-            </w:tcBorders>
-            <w:tcMar>
-              <w:top w:type="dxa" w:w="60"/>
-              <w:left w:type="dxa" w:w="100"/>
-              <w:bottom w:type="dxa" w:w="60"/>
-              <w:right w:type="dxa" w:w="100"/>
-            </w:tcMar>
-          </w:tcPr>
-          <w:p>
-            <w:pPr>
-              <w:spacing w:after="20" w:line="252"/>
-            </w:pPr>
-            <w:r>
-              <w:rPr>
-                <w:rFonts w:ascii="Arial" w:cs="Arial" w:eastAsia="Arial" w:hAnsi="Arial"/>
-                <w:sz w:val="17"/>
-                <w:szCs w:val="17"/>
-              </w:rPr>
-              <w:t xml:space="preserve">R.23</w:t>
-            </w:r>
-          </w:p>
-        </w:tc>
-        <w:tc>
-          <w:tcPr>
-            <w:tcW w:type="dxa" w:w="3600"/>
-            <w:tcBorders>
-              <w:top w:val="single" w:color="BFBFBF" w:sz="4"/>
-              <w:left w:val="single" w:color="BFBFBF" w:sz="4"/>
-              <w:bottom w:val="single" w:color="BFBFBF" w:sz="4"/>
-              <w:right w:val="single" w:color="BFBFBF" w:sz="4"/>
-            </w:tcBorders>
-            <w:tcMar>
-              <w:top w:type="dxa" w:w="60"/>
-              <w:left w:type="dxa" w:w="100"/>
-              <w:bottom w:type="dxa" w:w="60"/>
-              <w:right w:type="dxa" w:w="100"/>
-            </w:tcMar>
-          </w:tcPr>
-          <w:p>
-            <w:pPr>
-              <w:spacing w:after="20" w:line="252"/>
-            </w:pPr>
-            <w:r>
-              <w:rPr>
-                <w:rFonts w:ascii="Arial" w:cs="Arial" w:eastAsia="Arial" w:hAnsi="Arial"/>
-                <w:sz w:val="17"/>
-                <w:szCs w:val="17"/>
-              </w:rPr>
-              <w:t xml:space="preserve">Todas las suites</w:t>
-            </w:r>
-          </w:p>
-        </w:tc>
-        <w:tc>
-          <w:tcPr>
-            <w:tcW w:type="dxa" w:w="4260"/>
-            <w:tcBorders>
-              <w:top w:val="single" w:color="BFBFBF" w:sz="4"/>
-              <w:left w:val="single" w:color="BFBFBF" w:sz="4"/>
-              <w:bottom w:val="single" w:color="BFBFBF" w:sz="4"/>
-              <w:right w:val="single" w:color="BFBFBF" w:sz="4"/>
-            </w:tcBorders>
-            <w:tcMar>
-              <w:top w:type="dxa" w:w="60"/>
-              <w:left w:type="dxa" w:w="100"/>
-              <w:bottom w:type="dxa" w:w="60"/>
-              <w:right w:type="dxa" w:w="100"/>
-            </w:tcMar>
-          </w:tcPr>
-          <w:p>
-            <w:pPr>
-              <w:spacing w:after="20" w:line="252"/>
-            </w:pPr>
-            <w:r>
-              <w:rPr>
-                <w:rFonts w:ascii="Arial" w:cs="Arial" w:eastAsia="Arial" w:hAnsi="Arial"/>
-                <w:sz w:val="17"/>
-                <w:szCs w:val="17"/>
-              </w:rPr>
-              <w:t xml:space="preserve">132 pruebas; cobertura del código fuente reportada en el Documento de cobertura de testing.</w:t>
+              <w:t xml:space="preserve">10 de 10 exitosas; cobertura reportada en el Documento de cobertura de testing.</w:t>
             </w:r>
           </w:p>
         </w:tc>
       </w:tr>
     </w:tbl>
+    <w:p>
+      <w:pPr>
+        <w:spacing w:after="120" w:before="120"/>
+      </w:pPr>
+      <w:r>
+        <w:rPr>
+          <w:rFonts w:ascii="Arial" w:cs="Arial" w:eastAsia="Arial" w:hAnsi="Arial"/>
+        </w:rPr>
+        <w:t xml:space="preserve">Los requisitos sin prueba automática (por ejemplo el panel de administración, R.15 a R.19) se verificaron manualmente y quedan como mejora para la siguiente versión.</w:t>
+      </w:r>
+    </w:p>
     <w:sectPr>
       <w:headerReference w:type="default" r:id="rId7"/>
       <w:footerReference w:type="default" r:id="rId8"/>

</xml_diff>

<commit_message>
Documentos actualizados: ERS 2.1, cobertura de las 15 pruebas, guía de defensa y plan de estudio
- ERS: revisión 2.1, equipo (Isabel Cántaro), Atomic Design, BrowserRouter y matriz con las 15 pruebas
- Documento de cobertura con las cifras actuales (68,9 % sentencias, 58,8 % ramas, 69,4 % funciones, 72,9 % líneas)
- Guía de defensa y plan de 2 días reescritos para la nueva estructura y las 10 pruebas de defensa
- README con la estructura, las decisiones técnicas y los comandos nuevos
- Workflow de Pages: las pruebas corren con ChromeHeadlessCI
</commit_message>
<xml_diff>
--- a/docs/ERS_ForeverInk_v2.docx
+++ b/docs/ERS_ForeverInk_v2.docx
@@ -86,7 +86,7 @@
           <w:sz w:val="22"/>
           <w:szCs w:val="22"/>
         </w:rPr>
-        <w:t xml:space="preserve">Revisión: 2.0 (Evaluación Parcial 2)</w:t>
+        <w:t>Revisión: 2.1 (Evaluación Parcial 2)</w:t>
       </w:r>
     </w:p>
     <w:p>
@@ -100,7 +100,7 @@
           <w:sz w:val="22"/>
           <w:szCs w:val="22"/>
         </w:rPr>
-        <w:t xml:space="preserve">11 de octubre de 2026</w:t>
+        <w:t>21 de octubre de 2026</w:t>
       </w:r>
     </w:p>
     <w:p>
@@ -153,7 +153,7 @@
           <w:sz w:val="20"/>
           <w:szCs w:val="20"/>
         </w:rPr>
-        <w:t xml:space="preserve">Equipo: Isabel Cántaro · Valentine Gaete</w:t>
+        <w:t>Equipo: Isabel Cántaro</w:t>
       </w:r>
     </w:p>
     <w:p>
@@ -699,6 +699,135 @@
           </w:p>
         </w:tc>
       </w:tr>
+      <w:tr>
+        <w:trPr>
+          <w:cantSplit/>
+        </w:trPr>
+        <w:tc>
+          <w:tcPr>
+            <w:tcW w:type="dxa" w:w="1500"/>
+            <w:tcBorders>
+              <w:top w:val="single" w:color="BFBFBF" w:sz="4"/>
+              <w:left w:val="single" w:color="BFBFBF" w:sz="4"/>
+              <w:bottom w:val="single" w:color="BFBFBF" w:sz="4"/>
+              <w:right w:val="single" w:color="BFBFBF" w:sz="4"/>
+            </w:tcBorders>
+            <w:shd w:fill="FAFAFA" w:val="clear"/>
+            <w:tcMar>
+              <w:top w:type="dxa" w:w="60"/>
+              <w:left w:type="dxa" w:w="100"/>
+              <w:bottom w:type="dxa" w:w="60"/>
+              <w:right w:type="dxa" w:w="100"/>
+            </w:tcMar>
+          </w:tcPr>
+          <w:p>
+            <w:pPr>
+              <w:spacing w:after="20" w:line="252"/>
+            </w:pPr>
+            <w:r>
+              <w:rPr>
+                <w:rFonts w:ascii="Arial" w:cs="Arial" w:eastAsia="Arial" w:hAnsi="Arial"/>
+                <w:sz w:val="19"/>
+                <w:szCs w:val="19"/>
+              </w:rPr>
+              <w:t>21/10/2026</w:t>
+            </w:r>
+          </w:p>
+        </w:tc>
+        <w:tc>
+          <w:tcPr>
+            <w:tcW w:type="dxa" w:w="1000"/>
+            <w:tcBorders>
+              <w:top w:val="single" w:color="BFBFBF" w:sz="4"/>
+              <w:left w:val="single" w:color="BFBFBF" w:sz="4"/>
+              <w:bottom w:val="single" w:color="BFBFBF" w:sz="4"/>
+              <w:right w:val="single" w:color="BFBFBF" w:sz="4"/>
+            </w:tcBorders>
+            <w:shd w:fill="FAFAFA" w:val="clear"/>
+            <w:tcMar>
+              <w:top w:type="dxa" w:w="60"/>
+              <w:left w:type="dxa" w:w="100"/>
+              <w:bottom w:type="dxa" w:w="60"/>
+              <w:right w:type="dxa" w:w="100"/>
+            </w:tcMar>
+          </w:tcPr>
+          <w:p>
+            <w:pPr>
+              <w:spacing w:after="20" w:line="252"/>
+            </w:pPr>
+            <w:r>
+              <w:rPr>
+                <w:rFonts w:ascii="Arial" w:cs="Arial" w:eastAsia="Arial" w:hAnsi="Arial"/>
+                <w:sz w:val="19"/>
+                <w:szCs w:val="19"/>
+              </w:rPr>
+              <w:t>2.1</w:t>
+            </w:r>
+          </w:p>
+        </w:tc>
+        <w:tc>
+          <w:tcPr>
+            <w:tcW w:type="dxa" w:w="2600"/>
+            <w:tcBorders>
+              <w:top w:val="single" w:color="BFBFBF" w:sz="4"/>
+              <w:left w:val="single" w:color="BFBFBF" w:sz="4"/>
+              <w:bottom w:val="single" w:color="BFBFBF" w:sz="4"/>
+              <w:right w:val="single" w:color="BFBFBF" w:sz="4"/>
+            </w:tcBorders>
+            <w:shd w:fill="FAFAFA" w:val="clear"/>
+            <w:tcMar>
+              <w:top w:type="dxa" w:w="60"/>
+              <w:left w:type="dxa" w:w="100"/>
+              <w:bottom w:type="dxa" w:w="60"/>
+              <w:right w:type="dxa" w:w="100"/>
+            </w:tcMar>
+          </w:tcPr>
+          <w:p>
+            <w:pPr>
+              <w:spacing w:after="20" w:line="252"/>
+            </w:pPr>
+            <w:r>
+              <w:rPr>
+                <w:rFonts w:ascii="Arial" w:cs="Arial" w:eastAsia="Arial" w:hAnsi="Arial"/>
+                <w:sz w:val="19"/>
+                <w:szCs w:val="19"/>
+              </w:rPr>
+              <w:t>Isabel Cántaro</w:t>
+            </w:r>
+          </w:p>
+        </w:tc>
+        <w:tc>
+          <w:tcPr>
+            <w:tcW w:type="dxa" w:w="4260"/>
+            <w:tcBorders>
+              <w:top w:val="single" w:color="BFBFBF" w:sz="4"/>
+              <w:left w:val="single" w:color="BFBFBF" w:sz="4"/>
+              <w:bottom w:val="single" w:color="BFBFBF" w:sz="4"/>
+              <w:right w:val="single" w:color="BFBFBF" w:sz="4"/>
+            </w:tcBorders>
+            <w:shd w:fill="FAFAFA" w:val="clear"/>
+            <w:tcMar>
+              <w:top w:type="dxa" w:w="60"/>
+              <w:left w:type="dxa" w:w="100"/>
+              <w:bottom w:type="dxa" w:w="60"/>
+              <w:right w:type="dxa" w:w="100"/>
+            </w:tcMar>
+          </w:tcPr>
+          <w:p>
+            <w:pPr>
+              <w:spacing w:after="20" w:line="252"/>
+            </w:pPr>
+            <w:r>
+              <w:rPr>
+                <w:rFonts w:ascii="Arial" w:cs="Arial" w:eastAsia="Arial" w:hAnsi="Arial"/>
+                <w:sz w:val="19"/>
+                <w:szCs w:val="19"/>
+              </w:rPr>
+              <w:t>Adaptación al material de la asignatura: componentes con Atomic Design, BrowserRouter, imágenes importadas desde src/assets, hoja de estilos en formato estándar con tabla de contenido y enfoque mobile first, Error Boundary, carga diferida del panel y 15 pruebas (10 de defensa y 5 complementarias). El equipo queda conformado por Isabel Cántaro.</w:t>
+            </w:r>
+          </w:p>
+        </w:tc>
+      </w:tr>
     </w:tbl>
     <w:p>
       <w:pPr>
@@ -1934,7 +2063,7 @@
                 <w:sz w:val="19"/>
                 <w:szCs w:val="19"/>
               </w:rPr>
-              <w:t xml:space="preserve">React Router</w:t>
+              <w:t>React Router</w:t>
             </w:r>
           </w:p>
         </w:tc>
@@ -1965,7 +2094,7 @@
                 <w:sz w:val="19"/>
                 <w:szCs w:val="19"/>
               </w:rPr>
-              <w:t xml:space="preserve">Biblioteca de navegación entre vistas. Se usa HashRouter para que el sitio funcione en GitHub Pages.</w:t>
+              <w:t>Biblioteca de navegación entre vistas. Se usa BrowserRouter (envuelve a &lt;App /&gt; en main.jsx), como en el material de la asignatura.</w:t>
             </w:r>
           </w:p>
         </w:tc>
@@ -2626,6 +2755,140 @@
                 <w:szCs w:val="19"/>
               </w:rPr>
               <w:t xml:space="preserve">Porcentaje del código fuente (sentencias, ramas, funciones, líneas) ejecutado por las pruebas.</w:t>
+            </w:r>
+          </w:p>
+        </w:tc>
+      </w:tr>
+      <w:tr>
+        <w:trPr>
+          <w:cantSplit/>
+        </w:trPr>
+        <w:tc>
+          <w:tcPr>
+            <w:tcW w:type="dxa" w:w="2400"/>
+            <w:tcBorders>
+              <w:top w:val="single" w:color="BFBFBF" w:sz="4"/>
+              <w:left w:val="single" w:color="BFBFBF" w:sz="4"/>
+              <w:bottom w:val="single" w:color="BFBFBF" w:sz="4"/>
+              <w:right w:val="single" w:color="BFBFBF" w:sz="4"/>
+            </w:tcBorders>
+            <w:shd w:fill="FAFAFA" w:val="clear"/>
+            <w:tcMar>
+              <w:top w:type="dxa" w:w="60"/>
+              <w:left w:type="dxa" w:w="100"/>
+              <w:bottom w:type="dxa" w:w="60"/>
+              <w:right w:type="dxa" w:w="100"/>
+            </w:tcMar>
+          </w:tcPr>
+          <w:p>
+            <w:pPr>
+              <w:spacing w:after="20" w:line="252"/>
+            </w:pPr>
+            <w:r>
+              <w:rPr>
+                <w:rFonts w:ascii="Arial" w:cs="Arial" w:eastAsia="Arial" w:hAnsi="Arial"/>
+                <w:sz w:val="19"/>
+                <w:szCs w:val="19"/>
+              </w:rPr>
+              <w:t>Atomic Design</w:t>
+            </w:r>
+          </w:p>
+        </w:tc>
+        <w:tc>
+          <w:tcPr>
+            <w:tcW w:type="dxa" w:w="6960"/>
+            <w:tcBorders>
+              <w:top w:val="single" w:color="BFBFBF" w:sz="4"/>
+              <w:left w:val="single" w:color="BFBFBF" w:sz="4"/>
+              <w:bottom w:val="single" w:color="BFBFBF" w:sz="4"/>
+              <w:right w:val="single" w:color="BFBFBF" w:sz="4"/>
+            </w:tcBorders>
+            <w:shd w:fill="FAFAFA" w:val="clear"/>
+            <w:tcMar>
+              <w:top w:type="dxa" w:w="60"/>
+              <w:left w:type="dxa" w:w="100"/>
+              <w:bottom w:type="dxa" w:w="60"/>
+              <w:right w:type="dxa" w:w="100"/>
+            </w:tcMar>
+          </w:tcPr>
+          <w:p>
+            <w:pPr>
+              <w:spacing w:after="20" w:line="252"/>
+            </w:pPr>
+            <w:r>
+              <w:rPr>
+                <w:rFonts w:ascii="Arial" w:cs="Arial" w:eastAsia="Arial" w:hAnsi="Arial"/>
+                <w:sz w:val="19"/>
+                <w:szCs w:val="19"/>
+              </w:rPr>
+              <w:t>Metodología de Brad Frost que divide la interfaz en átomos (botón, logo), moléculas (tarjeta, campo con etiqueta), organismos (barra de navegación, formularios), plantillas (estructura de página) y páginas.</w:t>
+            </w:r>
+          </w:p>
+        </w:tc>
+      </w:tr>
+      <w:tr>
+        <w:trPr>
+          <w:cantSplit/>
+        </w:trPr>
+        <w:tc>
+          <w:tcPr>
+            <w:tcW w:type="dxa" w:w="2400"/>
+            <w:tcBorders>
+              <w:top w:val="single" w:color="BFBFBF" w:sz="4"/>
+              <w:left w:val="single" w:color="BFBFBF" w:sz="4"/>
+              <w:bottom w:val="single" w:color="BFBFBF" w:sz="4"/>
+              <w:right w:val="single" w:color="BFBFBF" w:sz="4"/>
+            </w:tcBorders>
+            <w:shd w:fill="FAFAFA" w:val="clear"/>
+            <w:tcMar>
+              <w:top w:type="dxa" w:w="60"/>
+              <w:left w:type="dxa" w:w="100"/>
+              <w:bottom w:type="dxa" w:w="60"/>
+              <w:right w:type="dxa" w:w="100"/>
+            </w:tcMar>
+          </w:tcPr>
+          <w:p>
+            <w:pPr>
+              <w:spacing w:after="20" w:line="252"/>
+            </w:pPr>
+            <w:r>
+              <w:rPr>
+                <w:rFonts w:ascii="Arial" w:cs="Arial" w:eastAsia="Arial" w:hAnsi="Arial"/>
+                <w:sz w:val="19"/>
+                <w:szCs w:val="19"/>
+              </w:rPr>
+              <w:t>Error Boundary</w:t>
+            </w:r>
+          </w:p>
+        </w:tc>
+        <w:tc>
+          <w:tcPr>
+            <w:tcW w:type="dxa" w:w="6960"/>
+            <w:tcBorders>
+              <w:top w:val="single" w:color="BFBFBF" w:sz="4"/>
+              <w:left w:val="single" w:color="BFBFBF" w:sz="4"/>
+              <w:bottom w:val="single" w:color="BFBFBF" w:sz="4"/>
+              <w:right w:val="single" w:color="BFBFBF" w:sz="4"/>
+            </w:tcBorders>
+            <w:shd w:fill="FAFAFA" w:val="clear"/>
+            <w:tcMar>
+              <w:top w:type="dxa" w:w="60"/>
+              <w:left w:type="dxa" w:w="100"/>
+              <w:bottom w:type="dxa" w:w="60"/>
+              <w:right w:type="dxa" w:w="100"/>
+            </w:tcMar>
+          </w:tcPr>
+          <w:p>
+            <w:pPr>
+              <w:spacing w:after="20" w:line="252"/>
+            </w:pPr>
+            <w:r>
+              <w:rPr>
+                <w:rFonts w:ascii="Arial" w:cs="Arial" w:eastAsia="Arial" w:hAnsi="Arial"/>
+                <w:sz w:val="19"/>
+                <w:szCs w:val="19"/>
+              </w:rPr>
+              <w:t>Componente de clase que atrapa los errores al dibujar sus hijos y muestra un mensaje de respaldo en vez de una pantalla en blanco (LimiteDeErrores).</w:t>
             </w:r>
           </w:p>
         </w:tc>
@@ -3127,7 +3390,7 @@
                 <w:sz w:val="19"/>
                 <w:szCs w:val="19"/>
               </w:rPr>
-              <w:t xml:space="preserve">Componentes</w:t>
+              <w:t>Componentes</w:t>
             </w:r>
           </w:p>
         </w:tc>
@@ -3158,58 +3421,7 @@
                 <w:sz w:val="19"/>
                 <w:szCs w:val="19"/>
               </w:rPr>
-              <w:t xml:space="preserve">Piezas reutilizables de interfaz que reciben props y gestionan su propio estado (</w:t>
-            </w:r>
-            <w:r>
-              <w:rPr>
-                <w:rFonts w:ascii="Consolas" w:cs="Consolas" w:eastAsia="Consolas" w:hAnsi="Consolas"/>
-                <w:sz w:val="19"/>
-                <w:szCs w:val="19"/>
-                <w:shd w:fill="EFEFEF" w:val="clear"/>
-              </w:rPr>
-              <w:t xml:space="preserve">src/components/comunes</w:t>
-            </w:r>
-            <w:r>
-              <w:rPr>
-                <w:rFonts w:ascii="Arial" w:cs="Arial" w:eastAsia="Arial" w:hAnsi="Arial"/>
-                <w:sz w:val="19"/>
-                <w:szCs w:val="19"/>
-              </w:rPr>
-              <w:t xml:space="preserve">, </w:t>
-            </w:r>
-            <w:r>
-              <w:rPr>
-                <w:rFonts w:ascii="Consolas" w:cs="Consolas" w:eastAsia="Consolas" w:hAnsi="Consolas"/>
-                <w:sz w:val="19"/>
-                <w:szCs w:val="19"/>
-                <w:shd w:fill="EFEFEF" w:val="clear"/>
-              </w:rPr>
-              <w:t xml:space="preserve">tienda</w:t>
-            </w:r>
-            <w:r>
-              <w:rPr>
-                <w:rFonts w:ascii="Arial" w:cs="Arial" w:eastAsia="Arial" w:hAnsi="Arial"/>
-                <w:sz w:val="19"/>
-                <w:szCs w:val="19"/>
-              </w:rPr>
-              <w:t xml:space="preserve">, </w:t>
-            </w:r>
-            <w:r>
-              <w:rPr>
-                <w:rFonts w:ascii="Consolas" w:cs="Consolas" w:eastAsia="Consolas" w:hAnsi="Consolas"/>
-                <w:sz w:val="19"/>
-                <w:szCs w:val="19"/>
-                <w:shd w:fill="EFEFEF" w:val="clear"/>
-              </w:rPr>
-              <w:t xml:space="preserve">admin</w:t>
-            </w:r>
-            <w:r>
-              <w:rPr>
-                <w:rFonts w:ascii="Arial" w:cs="Arial" w:eastAsia="Arial" w:hAnsi="Arial"/>
-                <w:sz w:val="19"/>
-                <w:szCs w:val="19"/>
-              </w:rPr>
-              <w:t xml:space="preserve">).</w:t>
+              <w:t>Piezas reutilizables organizadas con Atomic Design: src/components/atomos, moleculas, organismos y plantillas. Los componentes sin interfaz propia (RutaProtegida, ScrollArriba, LimiteDeErrores) están en src/components/utilidades.</w:t>
             </w:r>
           </w:p>
         </w:tc>
@@ -3576,6 +3788,73 @@
                 <w:szCs w:val="19"/>
               </w:rPr>
               <w:t xml:space="preserve">).</w:t>
+            </w:r>
+          </w:p>
+        </w:tc>
+      </w:tr>
+      <w:tr>
+        <w:trPr>
+          <w:cantSplit/>
+        </w:trPr>
+        <w:tc>
+          <w:tcPr>
+            <w:tcW w:type="dxa" w:w="2200"/>
+            <w:tcBorders>
+              <w:top w:val="single" w:color="BFBFBF" w:sz="4"/>
+              <w:left w:val="single" w:color="BFBFBF" w:sz="4"/>
+              <w:bottom w:val="single" w:color="BFBFBF" w:sz="4"/>
+              <w:right w:val="single" w:color="BFBFBF" w:sz="4"/>
+            </w:tcBorders>
+            <w:shd w:fill="FAFAFA" w:val="clear"/>
+            <w:tcMar>
+              <w:top w:type="dxa" w:w="60"/>
+              <w:left w:type="dxa" w:w="100"/>
+              <w:bottom w:type="dxa" w:w="60"/>
+              <w:right w:type="dxa" w:w="100"/>
+            </w:tcMar>
+          </w:tcPr>
+          <w:p>
+            <w:pPr>
+              <w:spacing w:after="20" w:line="252"/>
+            </w:pPr>
+            <w:r>
+              <w:rPr>
+                <w:rFonts w:ascii="Arial" w:cs="Arial" w:eastAsia="Arial" w:hAnsi="Arial"/>
+                <w:sz w:val="19"/>
+                <w:szCs w:val="19"/>
+              </w:rPr>
+              <w:t>Recursos</w:t>
+            </w:r>
+          </w:p>
+        </w:tc>
+        <w:tc>
+          <w:tcPr>
+            <w:tcW w:type="dxa" w:w="7160"/>
+            <w:tcBorders>
+              <w:top w:val="single" w:color="BFBFBF" w:sz="4"/>
+              <w:left w:val="single" w:color="BFBFBF" w:sz="4"/>
+              <w:bottom w:val="single" w:color="BFBFBF" w:sz="4"/>
+              <w:right w:val="single" w:color="BFBFBF" w:sz="4"/>
+            </w:tcBorders>
+            <w:shd w:fill="FAFAFA" w:val="clear"/>
+            <w:tcMar>
+              <w:top w:type="dxa" w:w="60"/>
+              <w:left w:type="dxa" w:w="100"/>
+              <w:bottom w:type="dxa" w:w="60"/>
+              <w:right w:type="dxa" w:w="100"/>
+            </w:tcMar>
+          </w:tcPr>
+          <w:p>
+            <w:pPr>
+              <w:spacing w:after="20" w:line="252"/>
+            </w:pPr>
+            <w:r>
+              <w:rPr>
+                <w:rFonts w:ascii="Arial" w:cs="Arial" w:eastAsia="Arial" w:hAnsi="Arial"/>
+                <w:sz w:val="19"/>
+                <w:szCs w:val="19"/>
+              </w:rPr>
+              <w:t>Imágenes importadas desde src/assets (src/assets/images.js) y una única hoja de estilos propia (src/styles/tema.css).</w:t>
             </w:r>
           </w:p>
         </w:tc>
@@ -4221,7 +4500,7 @@
         <w:rPr>
           <w:rFonts w:ascii="Arial" w:cs="Arial" w:eastAsia="Arial" w:hAnsi="Arial"/>
         </w:rPr>
-        <w:t xml:space="preserve">El proyecto se desarrolla en equipo (máximo 3 integrantes); este equipo es de 2 integrantes.</w:t>
+        <w:t>El proyecto se desarrolla en equipo (máximo 3 integrantes); en esta entrega el equipo está conformado por 1 integrante (Isabel Cántaro).</w:t>
       </w:r>
     </w:p>
     <w:p>
@@ -6625,7 +6904,7 @@
                 <w:sz w:val="19"/>
                 <w:szCs w:val="19"/>
               </w:rPr>
-              <w:t xml:space="preserve">react-router-dom 7 (HashRouter)</w:t>
+              <w:t>react-router-dom 7 (BrowserRouter)</w:t>
             </w:r>
           </w:p>
         </w:tc>
@@ -6656,7 +6935,7 @@
                 <w:sz w:val="19"/>
                 <w:szCs w:val="19"/>
               </w:rPr>
-              <w:t xml:space="preserve">Navegación entre vistas y rutas protegidas.</w:t>
+              <w:t>Navegación entre vistas, parámetros de ruta (useParams), parámetros de búsqueda (useLocation) y rutas protegidas.</w:t>
             </w:r>
           </w:p>
         </w:tc>
@@ -6857,7 +7136,7 @@
                 <w:sz w:val="19"/>
                 <w:szCs w:val="19"/>
               </w:rPr>
-              <w:t xml:space="preserve">Jasmine, Karma y Testing Library</w:t>
+              <w:t>Jasmine, Karma, Testing Library y jasmine-dom</w:t>
             </w:r>
           </w:p>
         </w:tc>
@@ -6887,7 +7166,7 @@
                 <w:sz w:val="19"/>
                 <w:szCs w:val="19"/>
               </w:rPr>
-              <w:t xml:space="preserve">Pruebas unitarias y de componentes en un navegador real, con informe de cobertura (karma-coverage).</w:t>
+              <w:t>Pruebas unitarias y de componentes en un navegador real (Chrome sin ventana), con informe de cobertura (karma-coverage).</w:t>
             </w:r>
           </w:p>
         </w:tc>
@@ -12067,19 +12346,7 @@
         <w:rPr>
           <w:rFonts w:ascii="Arial" w:cs="Arial" w:eastAsia="Arial" w:hAnsi="Arial"/>
         </w:rPr>
-        <w:t xml:space="preserve">Las 10 pruebas unitarias protegen las reglas críticas del código frente a regresiones.</w:t>
-      </w:r>
-    </w:p>
-    <w:p>
-      <w:pPr>
-        <w:pStyle w:val="Heading3"/>
-        <w:keepNext/>
-      </w:pPr>
-      <w:r>
-        <w:rPr>
-          <w:rFonts w:ascii="Arial" w:cs="Arial" w:eastAsia="Arial" w:hAnsi="Arial"/>
-        </w:rPr>
-        <w:t xml:space="preserve">3.3.6. Portabilidad y usabilidad</w:t>
+        <w:t>Las 15 pruebas unitarias (10 de defensa y 5 complementarias) protegen los componentes y las reglas críticas del código frente a regresiones.</w:t>
       </w:r>
     </w:p>
     <w:p>
@@ -12095,7 +12362,19 @@
         <w:rPr>
           <w:rFonts w:ascii="Arial" w:cs="Arial" w:eastAsia="Arial" w:hAnsi="Arial"/>
         </w:rPr>
-        <w:t xml:space="preserve">El sitio funciona en cualquier navegador moderno, sin depender de un sistema operativo, y puede desplegarse en cualquier hosting estático.</w:t>
+        <w:t>Los estilos viven en una sola hoja (tema.css), escrita en formato estándar, con tabla de contenido y enfoque mobile first; los componentes no usan estilos en línea.</w:t>
+      </w:r>
+    </w:p>
+    <w:p>
+      <w:pPr>
+        <w:pStyle w:val="Heading3"/>
+        <w:keepNext/>
+      </w:pPr>
+      <w:r>
+        <w:rPr>
+          <w:rFonts w:ascii="Arial" w:cs="Arial" w:eastAsia="Arial" w:hAnsi="Arial"/>
+        </w:rPr>
+        <w:t xml:space="preserve">3.3.6. Portabilidad y usabilidad</w:t>
       </w:r>
     </w:p>
     <w:p>
@@ -12111,7 +12390,7 @@
         <w:rPr>
           <w:rFonts w:ascii="Arial" w:cs="Arial" w:eastAsia="Arial" w:hAnsi="Arial"/>
         </w:rPr>
-        <w:t xml:space="preserve">Se usa HashRouter para que las rutas funcionen en GitHub Pages sin configuración del servidor.</w:t>
+        <w:t xml:space="preserve">El sitio funciona en cualquier navegador moderno, sin depender de un sistema operativo, y puede desplegarse en cualquier hosting estático.</w:t>
       </w:r>
     </w:p>
     <w:p>
@@ -12127,19 +12406,7 @@
         <w:rPr>
           <w:rFonts w:ascii="Arial" w:cs="Arial" w:eastAsia="Arial" w:hAnsi="Arial"/>
         </w:rPr>
-        <w:t xml:space="preserve">Se cuidan la accesibilidad básica (etiquetas asociadas a cada campo, roles ARIA, contraste alto y enlace para saltar al contenido) y la legibilidad en móvil.</w:t>
-      </w:r>
-    </w:p>
-    <w:p>
-      <w:pPr>
-        <w:pStyle w:val="Heading2"/>
-        <w:keepNext/>
-      </w:pPr>
-      <w:r>
-        <w:rPr>
-          <w:rFonts w:ascii="Arial" w:cs="Arial" w:eastAsia="Arial" w:hAnsi="Arial"/>
-        </w:rPr>
-        <w:t xml:space="preserve">3.4. Otros requisitos</w:t>
+        <w:t>Se usa BrowserRouter. Para GitHub Pages el sitio se compila con la base /FullstackII/ y se publica una copia de index.html como 404.html, de modo que las rutas internas también carguen la aplicación.</w:t>
       </w:r>
     </w:p>
     <w:p>
@@ -12155,7 +12422,19 @@
         <w:rPr>
           <w:rFonts w:ascii="Arial" w:cs="Arial" w:eastAsia="Arial" w:hAnsi="Arial"/>
         </w:rPr>
-        <w:t xml:space="preserve">El equipo debe estar en condiciones de presentar el desarrollo funcional del sitio y de responder preguntas abiertas sobre las decisiones técnicas tomadas, de forma individual.</w:t>
+        <w:t xml:space="preserve">Se cuidan la accesibilidad básica (etiquetas asociadas a cada campo, roles ARIA, contraste alto y enlace para saltar al contenido) y la legibilidad en móvil.</w:t>
+      </w:r>
+    </w:p>
+    <w:p>
+      <w:pPr>
+        <w:pStyle w:val="Heading2"/>
+        <w:keepNext/>
+      </w:pPr>
+      <w:r>
+        <w:rPr>
+          <w:rFonts w:ascii="Arial" w:cs="Arial" w:eastAsia="Arial" w:hAnsi="Arial"/>
+        </w:rPr>
+        <w:t xml:space="preserve">3.4. Otros requisitos</w:t>
       </w:r>
     </w:p>
     <w:p>
@@ -12171,7 +12450,7 @@
         <w:rPr>
           <w:rFonts w:ascii="Arial" w:cs="Arial" w:eastAsia="Arial" w:hAnsi="Arial"/>
         </w:rPr>
-        <w:t xml:space="preserve">El repositorio de GitHub debe ser público y contener el proyecto actualizado, con historial de cambios y comentarios claros.</w:t>
+        <w:t xml:space="preserve">El equipo debe estar en condiciones de presentar el desarrollo funcional del sitio y de responder preguntas abiertas sobre las decisiones técnicas tomadas, de forma individual.</w:t>
       </w:r>
     </w:p>
     <w:p>
@@ -12187,11 +12466,27 @@
         <w:rPr>
           <w:rFonts w:ascii="Arial" w:cs="Arial" w:eastAsia="Arial" w:hAnsi="Arial"/>
         </w:rPr>
-        <w:t xml:space="preserve">Se entrega junto a este documento el Documento de cobertura de testing, que valida el alcance de los elementos cubiertos por las pruebas.</w:t>
+        <w:t xml:space="preserve">El repositorio de GitHub debe ser público y contener el proyecto actualizado, con historial de cambios y comentarios claros.</w:t>
       </w:r>
     </w:p>
     <w:p>
       <w:pPr>
+        <w:pStyle w:val="ListParagraph"/>
+        <w:numPr>
+          <w:ilvl w:val="0"/>
+          <w:numId w:val="2"/>
+        </w:numPr>
+        <w:spacing w:after="60" w:line="276"/>
+      </w:pPr>
+      <w:r>
+        <w:rPr>
+          <w:rFonts w:ascii="Arial" w:cs="Arial" w:eastAsia="Arial" w:hAnsi="Arial"/>
+        </w:rPr>
+        <w:t xml:space="preserve">Se entrega junto a este documento el Documento de cobertura de testing, que valida el alcance de los elementos cubiertos por las pruebas.</w:t>
+      </w:r>
+    </w:p>
+    <w:p>
+      <w:pPr>
         <w:pStyle w:val="Heading2"/>
         <w:keepNext/>
       </w:pPr>
@@ -12211,22 +12506,7 @@
         <w:rPr>
           <w:rFonts w:ascii="Arial" w:cs="Arial" w:eastAsia="Arial" w:hAnsi="Arial"/>
         </w:rPr>
-        <w:t xml:space="preserve">La siguiente matriz relaciona los requisitos con las 10 pruebas Jasmine que los verifican (carpeta </w:t>
-      </w:r>
-      <w:r>
-        <w:rPr>
-          <w:rFonts w:ascii="Consolas" w:cs="Consolas" w:eastAsia="Consolas" w:hAnsi="Consolas"/>
-          <w:sz w:val="20"/>
-          <w:szCs w:val="20"/>
-          <w:shd w:fill="EFEFEF" w:val="clear"/>
-        </w:rPr>
-        <w:t xml:space="preserve">test/</w:t>
-      </w:r>
-      <w:r>
-        <w:rPr>
-          <w:rFonts w:ascii="Arial" w:cs="Arial" w:eastAsia="Arial" w:hAnsi="Arial"/>
-        </w:rPr>
-        <w:t xml:space="preserve">):</w:t>
+        <w:t>La siguiente matriz relaciona los requisitos con las 15 pruebas Jasmine que los verifican (carpeta test/: defensa.spec.jsx = pruebas 1 a 10; complementarias.spec.jsx = pruebas 11 a 15):</w:t>
       </w:r>
     </w:p>
     <w:tbl>
@@ -12313,7 +12593,7 @@
                 <w:sz w:val="17"/>
                 <w:szCs w:val="17"/>
               </w:rPr>
-              <w:t xml:space="preserve">Prueba (archivo)</w:t>
+              <w:t>Prueba</w:t>
             </w:r>
           </w:p>
         </w:tc>
@@ -12381,7 +12661,7 @@
                 <w:sz w:val="17"/>
                 <w:szCs w:val="17"/>
               </w:rPr>
-              <w:t xml:space="preserve">R.2</w:t>
+              <w:t>R.1</w:t>
             </w:r>
           </w:p>
         </w:tc>
@@ -12411,24 +12691,7 @@
                 <w:sz w:val="17"/>
                 <w:szCs w:val="17"/>
               </w:rPr>
-              <w:t xml:space="preserve">5 · ListaProductos vacía (</w:t>
-            </w:r>
-            <w:r>
-              <w:rPr>
-                <w:rFonts w:ascii="Consolas" w:cs="Consolas" w:eastAsia="Consolas" w:hAnsi="Consolas"/>
-                <w:sz w:val="17"/>
-                <w:szCs w:val="17"/>
-                <w:shd w:fill="EFEFEF" w:val="clear"/>
-              </w:rPr>
-              <w:t xml:space="preserve">componentes.spec</w:t>
-            </w:r>
-            <w:r>
-              <w:rPr>
-                <w:rFonts w:ascii="Arial" w:cs="Arial" w:eastAsia="Arial" w:hAnsi="Arial"/>
-                <w:sz w:val="17"/>
-                <w:szCs w:val="17"/>
-              </w:rPr>
-              <w:t xml:space="preserve">)</w:t>
+              <w:t>13 · Recorrido de todas las vistas</w:t>
             </w:r>
           </w:p>
         </w:tc>
@@ -12458,7 +12721,7 @@
                 <w:sz w:val="17"/>
                 <w:szCs w:val="17"/>
               </w:rPr>
-              <w:t xml:space="preserve">Con lista vacía se muestra un mensaje en vez de tarjetas.</w:t>
+              <w:t>Cada ruta de la tienda y del panel se dibuja con su título.</w:t>
             </w:r>
           </w:p>
         </w:tc>
@@ -12476,25 +12739,24 @@
               <w:bottom w:val="single" w:color="BFBFBF" w:sz="4"/>
               <w:right w:val="single" w:color="BFBFBF" w:sz="4"/>
             </w:tcBorders>
-            <w:shd w:fill="FAFAFA" w:val="clear"/>
-            <w:tcMar>
-              <w:top w:type="dxa" w:w="60"/>
-              <w:left w:type="dxa" w:w="100"/>
-              <w:bottom w:type="dxa" w:w="60"/>
-              <w:right w:type="dxa" w:w="100"/>
-            </w:tcMar>
-          </w:tcPr>
-          <w:p>
-            <w:pPr>
-              <w:spacing w:after="20" w:line="252"/>
-            </w:pPr>
-            <w:r>
-              <w:rPr>
-                <w:rFonts w:ascii="Arial" w:cs="Arial" w:eastAsia="Arial" w:hAnsi="Arial"/>
-                <w:sz w:val="17"/>
-                <w:szCs w:val="17"/>
-              </w:rPr>
-              <w:t xml:space="preserve">R.3</w:t>
+            <w:tcMar>
+              <w:top w:type="dxa" w:w="60"/>
+              <w:left w:type="dxa" w:w="100"/>
+              <w:bottom w:type="dxa" w:w="60"/>
+              <w:right w:type="dxa" w:w="100"/>
+            </w:tcMar>
+          </w:tcPr>
+          <w:p>
+            <w:pPr>
+              <w:spacing w:after="20" w:line="252"/>
+            </w:pPr>
+            <w:r>
+              <w:rPr>
+                <w:rFonts w:ascii="Arial" w:cs="Arial" w:eastAsia="Arial" w:hAnsi="Arial"/>
+                <w:sz w:val="17"/>
+                <w:szCs w:val="17"/>
+              </w:rPr>
+              <w:t>R.2</w:t>
             </w:r>
           </w:p>
         </w:tc>
@@ -12507,42 +12769,24 @@
               <w:bottom w:val="single" w:color="BFBFBF" w:sz="4"/>
               <w:right w:val="single" w:color="BFBFBF" w:sz="4"/>
             </w:tcBorders>
-            <w:shd w:fill="FAFAFA" w:val="clear"/>
-            <w:tcMar>
-              <w:top w:type="dxa" w:w="60"/>
-              <w:left w:type="dxa" w:w="100"/>
-              <w:bottom w:type="dxa" w:w="60"/>
-              <w:right w:type="dxa" w:w="100"/>
-            </w:tcMar>
-          </w:tcPr>
-          <w:p>
-            <w:pPr>
-              <w:spacing w:after="20" w:line="252"/>
-            </w:pPr>
-            <w:r>
-              <w:rPr>
-                <w:rFonts w:ascii="Arial" w:cs="Arial" w:eastAsia="Arial" w:hAnsi="Arial"/>
-                <w:sz w:val="17"/>
-                <w:szCs w:val="17"/>
-              </w:rPr>
-              <w:t xml:space="preserve">6 · Galería (</w:t>
-            </w:r>
-            <w:r>
-              <w:rPr>
-                <w:rFonts w:ascii="Consolas" w:cs="Consolas" w:eastAsia="Consolas" w:hAnsi="Consolas"/>
-                <w:sz w:val="17"/>
-                <w:szCs w:val="17"/>
-                <w:shd w:fill="EFEFEF" w:val="clear"/>
-              </w:rPr>
-              <w:t xml:space="preserve">componentes.spec</w:t>
-            </w:r>
-            <w:r>
-              <w:rPr>
-                <w:rFonts w:ascii="Arial" w:cs="Arial" w:eastAsia="Arial" w:hAnsi="Arial"/>
-                <w:sz w:val="17"/>
-                <w:szCs w:val="17"/>
-              </w:rPr>
-              <w:t xml:space="preserve">)</w:t>
+            <w:tcMar>
+              <w:top w:type="dxa" w:w="60"/>
+              <w:left w:type="dxa" w:w="100"/>
+              <w:bottom w:type="dxa" w:w="60"/>
+              <w:right w:type="dxa" w:w="100"/>
+            </w:tcMar>
+          </w:tcPr>
+          <w:p>
+            <w:pPr>
+              <w:spacing w:after="20" w:line="252"/>
+            </w:pPr>
+            <w:r>
+              <w:rPr>
+                <w:rFonts w:ascii="Arial" w:cs="Arial" w:eastAsia="Arial" w:hAnsi="Arial"/>
+                <w:sz w:val="17"/>
+                <w:szCs w:val="17"/>
+              </w:rPr>
+              <w:t>1 · ListaProductos</w:t>
             </w:r>
           </w:p>
         </w:tc>
@@ -12555,25 +12799,24 @@
               <w:bottom w:val="single" w:color="BFBFBF" w:sz="4"/>
               <w:right w:val="single" w:color="BFBFBF" w:sz="4"/>
             </w:tcBorders>
-            <w:shd w:fill="FAFAFA" w:val="clear"/>
-            <w:tcMar>
-              <w:top w:type="dxa" w:w="60"/>
-              <w:left w:type="dxa" w:w="100"/>
-              <w:bottom w:type="dxa" w:w="60"/>
-              <w:right w:type="dxa" w:w="100"/>
-            </w:tcMar>
-          </w:tcPr>
-          <w:p>
-            <w:pPr>
-              <w:spacing w:after="20" w:line="252"/>
-            </w:pPr>
-            <w:r>
-              <w:rPr>
-                <w:rFonts w:ascii="Arial" w:cs="Arial" w:eastAsia="Arial" w:hAnsi="Arial"/>
-                <w:sz w:val="17"/>
-                <w:szCs w:val="17"/>
-              </w:rPr>
-              <w:t xml:space="preserve">Al hacer clic en una miniatura cambia la imagen principal.</w:t>
+            <w:tcMar>
+              <w:top w:type="dxa" w:w="60"/>
+              <w:left w:type="dxa" w:w="100"/>
+              <w:bottom w:type="dxa" w:w="60"/>
+              <w:right w:type="dxa" w:w="100"/>
+            </w:tcMar>
+          </w:tcPr>
+          <w:p>
+            <w:pPr>
+              <w:spacing w:after="20" w:line="252"/>
+            </w:pPr>
+            <w:r>
+              <w:rPr>
+                <w:rFonts w:ascii="Arial" w:cs="Arial" w:eastAsia="Arial" w:hAnsi="Arial"/>
+                <w:sz w:val="17"/>
+                <w:szCs w:val="17"/>
+              </w:rPr>
+              <w:t>Se dibuja una tarjeta por cada diseño del catálogo.</w:t>
             </w:r>
           </w:p>
         </w:tc>
@@ -12608,7 +12851,7 @@
                 <w:sz w:val="17"/>
                 <w:szCs w:val="17"/>
               </w:rPr>
-              <w:t xml:space="preserve">R.6</w:t>
+              <w:t>R.3</w:t>
             </w:r>
           </w:p>
         </w:tc>
@@ -12638,41 +12881,7 @@
                 <w:sz w:val="17"/>
                 <w:szCs w:val="17"/>
               </w:rPr>
-              <w:t xml:space="preserve">2 · Máximo 5 unidades (</w:t>
-            </w:r>
-            <w:r>
-              <w:rPr>
-                <w:rFonts w:ascii="Consolas" w:cs="Consolas" w:eastAsia="Consolas" w:hAnsi="Consolas"/>
-                <w:sz w:val="17"/>
-                <w:szCs w:val="17"/>
-                <w:shd w:fill="EFEFEF" w:val="clear"/>
-              </w:rPr>
-              <w:t xml:space="preserve">logica.spec</w:t>
-            </w:r>
-            <w:r>
-              <w:rPr>
-                <w:rFonts w:ascii="Arial" w:cs="Arial" w:eastAsia="Arial" w:hAnsi="Arial"/>
-                <w:sz w:val="17"/>
-                <w:szCs w:val="17"/>
-              </w:rPr>
-              <w:t xml:space="preserve">); 4 · TarjetaProducto (</w:t>
-            </w:r>
-            <w:r>
-              <w:rPr>
-                <w:rFonts w:ascii="Consolas" w:cs="Consolas" w:eastAsia="Consolas" w:hAnsi="Consolas"/>
-                <w:sz w:val="17"/>
-                <w:szCs w:val="17"/>
-                <w:shd w:fill="EFEFEF" w:val="clear"/>
-              </w:rPr>
-              <w:t xml:space="preserve">componentes.spec</w:t>
-            </w:r>
-            <w:r>
-              <w:rPr>
-                <w:rFonts w:ascii="Arial" w:cs="Arial" w:eastAsia="Arial" w:hAnsi="Arial"/>
-                <w:sz w:val="17"/>
-                <w:szCs w:val="17"/>
-              </w:rPr>
-              <w:t xml:space="preserve">)</w:t>
+              <w:t>5 · Galería</w:t>
             </w:r>
           </w:p>
         </w:tc>
@@ -12702,7 +12911,7 @@
                 <w:sz w:val="17"/>
                 <w:szCs w:val="17"/>
               </w:rPr>
-              <w:t xml:space="preserve">La regla de máximo por diseño y que el botón Añadir avise al padre con el producto.</w:t>
+              <w:t>Al hacer clic en una miniatura cambia la imagen principal.</w:t>
             </w:r>
           </w:p>
         </w:tc>
@@ -12720,25 +12929,24 @@
               <w:bottom w:val="single" w:color="BFBFBF" w:sz="4"/>
               <w:right w:val="single" w:color="BFBFBF" w:sz="4"/>
             </w:tcBorders>
-            <w:shd w:fill="FAFAFA" w:val="clear"/>
-            <w:tcMar>
-              <w:top w:type="dxa" w:w="60"/>
-              <w:left w:type="dxa" w:w="100"/>
-              <w:bottom w:type="dxa" w:w="60"/>
-              <w:right w:type="dxa" w:w="100"/>
-            </w:tcMar>
-          </w:tcPr>
-          <w:p>
-            <w:pPr>
-              <w:spacing w:after="20" w:line="252"/>
-            </w:pPr>
-            <w:r>
-              <w:rPr>
-                <w:rFonts w:ascii="Arial" w:cs="Arial" w:eastAsia="Arial" w:hAnsi="Arial"/>
-                <w:sz w:val="17"/>
-                <w:szCs w:val="17"/>
-              </w:rPr>
-              <w:t xml:space="preserve">R.7</w:t>
+            <w:tcMar>
+              <w:top w:type="dxa" w:w="60"/>
+              <w:left w:type="dxa" w:w="100"/>
+              <w:bottom w:type="dxa" w:w="60"/>
+              <w:right w:type="dxa" w:w="100"/>
+            </w:tcMar>
+          </w:tcPr>
+          <w:p>
+            <w:pPr>
+              <w:spacing w:after="20" w:line="252"/>
+            </w:pPr>
+            <w:r>
+              <w:rPr>
+                <w:rFonts w:ascii="Arial" w:cs="Arial" w:eastAsia="Arial" w:hAnsi="Arial"/>
+                <w:sz w:val="17"/>
+                <w:szCs w:val="17"/>
+              </w:rPr>
+              <w:t>R.6</w:t>
             </w:r>
           </w:p>
         </w:tc>
@@ -12751,42 +12959,24 @@
               <w:bottom w:val="single" w:color="BFBFBF" w:sz="4"/>
               <w:right w:val="single" w:color="BFBFBF" w:sz="4"/>
             </w:tcBorders>
-            <w:shd w:fill="FAFAFA" w:val="clear"/>
-            <w:tcMar>
-              <w:top w:type="dxa" w:w="60"/>
-              <w:left w:type="dxa" w:w="100"/>
-              <w:bottom w:type="dxa" w:w="60"/>
-              <w:right w:type="dxa" w:w="100"/>
-            </w:tcMar>
-          </w:tcPr>
-          <w:p>
-            <w:pPr>
-              <w:spacing w:after="20" w:line="252"/>
-            </w:pPr>
-            <w:r>
-              <w:rPr>
-                <w:rFonts w:ascii="Arial" w:cs="Arial" w:eastAsia="Arial" w:hAnsi="Arial"/>
-                <w:sz w:val="17"/>
-                <w:szCs w:val="17"/>
-              </w:rPr>
-              <w:t xml:space="preserve">10 · Hora ocupada solo si está pagada (</w:t>
-            </w:r>
-            <w:r>
-              <w:rPr>
-                <w:rFonts w:ascii="Consolas" w:cs="Consolas" w:eastAsia="Consolas" w:hAnsi="Consolas"/>
-                <w:sz w:val="17"/>
-                <w:szCs w:val="17"/>
-                <w:shd w:fill="EFEFEF" w:val="clear"/>
-              </w:rPr>
-              <w:t xml:space="preserve">logica.spec</w:t>
-            </w:r>
-            <w:r>
-              <w:rPr>
-                <w:rFonts w:ascii="Arial" w:cs="Arial" w:eastAsia="Arial" w:hAnsi="Arial"/>
-                <w:sz w:val="17"/>
-                <w:szCs w:val="17"/>
-              </w:rPr>
-              <w:t xml:space="preserve">)</w:t>
+            <w:tcMar>
+              <w:top w:type="dxa" w:w="60"/>
+              <w:left w:type="dxa" w:w="100"/>
+              <w:bottom w:type="dxa" w:w="60"/>
+              <w:right w:type="dxa" w:w="100"/>
+            </w:tcMar>
+          </w:tcPr>
+          <w:p>
+            <w:pPr>
+              <w:spacing w:after="20" w:line="252"/>
+            </w:pPr>
+            <w:r>
+              <w:rPr>
+                <w:rFonts w:ascii="Arial" w:cs="Arial" w:eastAsia="Arial" w:hAnsi="Arial"/>
+                <w:sz w:val="17"/>
+                <w:szCs w:val="17"/>
+              </w:rPr>
+              <w:t>3 · Botón (átomo); 12 · Compra aprobada</w:t>
             </w:r>
           </w:p>
         </w:tc>
@@ -12799,25 +12989,24 @@
               <w:bottom w:val="single" w:color="BFBFBF" w:sz="4"/>
               <w:right w:val="single" w:color="BFBFBF" w:sz="4"/>
             </w:tcBorders>
-            <w:shd w:fill="FAFAFA" w:val="clear"/>
-            <w:tcMar>
-              <w:top w:type="dxa" w:w="60"/>
-              <w:left w:type="dxa" w:w="100"/>
-              <w:bottom w:type="dxa" w:w="60"/>
-              <w:right w:type="dxa" w:w="100"/>
-            </w:tcMar>
-          </w:tcPr>
-          <w:p>
-            <w:pPr>
-              <w:spacing w:after="20" w:line="252"/>
-            </w:pPr>
-            <w:r>
-              <w:rPr>
-                <w:rFonts w:ascii="Arial" w:cs="Arial" w:eastAsia="Arial" w:hAnsi="Arial"/>
-                <w:sz w:val="17"/>
-                <w:szCs w:val="17"/>
-              </w:rPr>
-              <w:t xml:space="preserve">Una orden pendiente deja la hora libre; al pagarla se ocupa.</w:t>
+            <w:tcMar>
+              <w:top w:type="dxa" w:w="60"/>
+              <w:left w:type="dxa" w:w="100"/>
+              <w:bottom w:type="dxa" w:w="60"/>
+              <w:right w:type="dxa" w:w="100"/>
+            </w:tcMar>
+          </w:tcPr>
+          <w:p>
+            <w:pPr>
+              <w:spacing w:after="20" w:line="252"/>
+            </w:pPr>
+            <w:r>
+              <w:rPr>
+                <w:rFonts w:ascii="Arial" w:cs="Arial" w:eastAsia="Arial" w:hAnsi="Arial"/>
+                <w:sz w:val="17"/>
+                <w:szCs w:val="17"/>
+              </w:rPr>
+              <w:t>El botón recibe etiqueta y onClick; al pagar se vacía el carrito.</w:t>
             </w:r>
           </w:p>
         </w:tc>
@@ -12852,7 +13041,7 @@
                 <w:sz w:val="17"/>
                 <w:szCs w:val="17"/>
               </w:rPr>
-              <w:t xml:space="preserve">R.8</w:t>
+              <w:t>R.7</w:t>
             </w:r>
           </w:p>
         </w:tc>
@@ -12882,24 +13071,7 @@
                 <w:sz w:val="17"/>
                 <w:szCs w:val="17"/>
               </w:rPr>
-              <w:t xml:space="preserve">9 · Pago rechazado con mock (</w:t>
-            </w:r>
-            <w:r>
-              <w:rPr>
-                <w:rFonts w:ascii="Consolas" w:cs="Consolas" w:eastAsia="Consolas" w:hAnsi="Consolas"/>
-                <w:sz w:val="17"/>
-                <w:szCs w:val="17"/>
-                <w:shd w:fill="EFEFEF" w:val="clear"/>
-              </w:rPr>
-              <w:t xml:space="preserve">checkout.spec</w:t>
-            </w:r>
-            <w:r>
-              <w:rPr>
-                <w:rFonts w:ascii="Arial" w:cs="Arial" w:eastAsia="Arial" w:hAnsi="Arial"/>
-                <w:sz w:val="17"/>
-                <w:szCs w:val="17"/>
-              </w:rPr>
-              <w:t xml:space="preserve">)</w:t>
+              <w:t>12 · Compra aprobada</w:t>
             </w:r>
           </w:p>
         </w:tc>
@@ -12929,7 +13101,7 @@
                 <w:sz w:val="17"/>
                 <w:szCs w:val="17"/>
               </w:rPr>
-              <w:t xml:space="preserve">Orden “Pago rechazado”, stock intacto y carrito conservado.</w:t>
+              <w:t>Al pagar, la hora elegida queda ocupada para ese tatuador.</w:t>
             </w:r>
           </w:p>
         </w:tc>
@@ -12947,25 +13119,24 @@
               <w:bottom w:val="single" w:color="BFBFBF" w:sz="4"/>
               <w:right w:val="single" w:color="BFBFBF" w:sz="4"/>
             </w:tcBorders>
-            <w:shd w:fill="FAFAFA" w:val="clear"/>
-            <w:tcMar>
-              <w:top w:type="dxa" w:w="60"/>
-              <w:left w:type="dxa" w:w="100"/>
-              <w:bottom w:type="dxa" w:w="60"/>
-              <w:right w:type="dxa" w:w="100"/>
-            </w:tcMar>
-          </w:tcPr>
-          <w:p>
-            <w:pPr>
-              <w:spacing w:after="20" w:line="252"/>
-            </w:pPr>
-            <w:r>
-              <w:rPr>
-                <w:rFonts w:ascii="Arial" w:cs="Arial" w:eastAsia="Arial" w:hAnsi="Arial"/>
-                <w:sz w:val="17"/>
-                <w:szCs w:val="17"/>
-              </w:rPr>
-              <w:t xml:space="preserve">R.10</w:t>
+            <w:tcMar>
+              <w:top w:type="dxa" w:w="60"/>
+              <w:left w:type="dxa" w:w="100"/>
+              <w:bottom w:type="dxa" w:w="60"/>
+              <w:right w:type="dxa" w:w="100"/>
+            </w:tcMar>
+          </w:tcPr>
+          <w:p>
+            <w:pPr>
+              <w:spacing w:after="20" w:line="252"/>
+            </w:pPr>
+            <w:r>
+              <w:rPr>
+                <w:rFonts w:ascii="Arial" w:cs="Arial" w:eastAsia="Arial" w:hAnsi="Arial"/>
+                <w:sz w:val="17"/>
+                <w:szCs w:val="17"/>
+              </w:rPr>
+              <w:t>R.8</w:t>
             </w:r>
           </w:p>
         </w:tc>
@@ -12978,42 +13149,24 @@
               <w:bottom w:val="single" w:color="BFBFBF" w:sz="4"/>
               <w:right w:val="single" w:color="BFBFBF" w:sz="4"/>
             </w:tcBorders>
-            <w:shd w:fill="FAFAFA" w:val="clear"/>
-            <w:tcMar>
-              <w:top w:type="dxa" w:w="60"/>
-              <w:left w:type="dxa" w:w="100"/>
-              <w:bottom w:type="dxa" w:w="60"/>
-              <w:right w:type="dxa" w:w="100"/>
-            </w:tcMar>
-          </w:tcPr>
-          <w:p>
-            <w:pPr>
-              <w:spacing w:after="20" w:line="252"/>
-            </w:pPr>
-            <w:r>
-              <w:rPr>
-                <w:rFonts w:ascii="Arial" w:cs="Arial" w:eastAsia="Arial" w:hAnsi="Arial"/>
-                <w:sz w:val="17"/>
-                <w:szCs w:val="17"/>
-              </w:rPr>
-              <w:t xml:space="preserve">1 · RUN inválido (</w:t>
-            </w:r>
-            <w:r>
-              <w:rPr>
-                <w:rFonts w:ascii="Consolas" w:cs="Consolas" w:eastAsia="Consolas" w:hAnsi="Consolas"/>
-                <w:sz w:val="17"/>
-                <w:szCs w:val="17"/>
-                <w:shd w:fill="EFEFEF" w:val="clear"/>
-              </w:rPr>
-              <w:t xml:space="preserve">logica.spec</w:t>
-            </w:r>
-            <w:r>
-              <w:rPr>
-                <w:rFonts w:ascii="Arial" w:cs="Arial" w:eastAsia="Arial" w:hAnsi="Arial"/>
-                <w:sz w:val="17"/>
-                <w:szCs w:val="17"/>
-              </w:rPr>
-              <w:t xml:space="preserve">)</w:t>
+            <w:tcMar>
+              <w:top w:type="dxa" w:w="60"/>
+              <w:left w:type="dxa" w:w="100"/>
+              <w:bottom w:type="dxa" w:w="60"/>
+              <w:right w:type="dxa" w:w="100"/>
+            </w:tcMar>
+          </w:tcPr>
+          <w:p>
+            <w:pPr>
+              <w:spacing w:after="20" w:line="252"/>
+            </w:pPr>
+            <w:r>
+              <w:rPr>
+                <w:rFonts w:ascii="Arial" w:cs="Arial" w:eastAsia="Arial" w:hAnsi="Arial"/>
+                <w:sz w:val="17"/>
+                <w:szCs w:val="17"/>
+              </w:rPr>
+              <w:t>8 · Pago rechazado (spyOn)</w:t>
             </w:r>
           </w:p>
         </w:tc>
@@ -13026,25 +13179,24 @@
               <w:bottom w:val="single" w:color="BFBFBF" w:sz="4"/>
               <w:right w:val="single" w:color="BFBFBF" w:sz="4"/>
             </w:tcBorders>
-            <w:shd w:fill="FAFAFA" w:val="clear"/>
-            <w:tcMar>
-              <w:top w:type="dxa" w:w="60"/>
-              <w:left w:type="dxa" w:w="100"/>
-              <w:bottom w:type="dxa" w:w="60"/>
-              <w:right w:type="dxa" w:w="100"/>
-            </w:tcMar>
-          </w:tcPr>
-          <w:p>
-            <w:pPr>
-              <w:spacing w:after="20" w:line="252"/>
-            </w:pPr>
-            <w:r>
-              <w:rPr>
-                <w:rFonts w:ascii="Arial" w:cs="Arial" w:eastAsia="Arial" w:hAnsi="Arial"/>
-                <w:sz w:val="17"/>
-                <w:szCs w:val="17"/>
-              </w:rPr>
-              <w:t xml:space="preserve">El RUN con dígito verificador incorrecto se rechaza.</w:t>
+            <w:tcMar>
+              <w:top w:type="dxa" w:w="60"/>
+              <w:left w:type="dxa" w:w="100"/>
+              <w:bottom w:type="dxa" w:w="60"/>
+              <w:right w:type="dxa" w:w="100"/>
+            </w:tcMar>
+          </w:tcPr>
+          <w:p>
+            <w:pPr>
+              <w:spacing w:after="20" w:line="252"/>
+            </w:pPr>
+            <w:r>
+              <w:rPr>
+                <w:rFonts w:ascii="Arial" w:cs="Arial" w:eastAsia="Arial" w:hAnsi="Arial"/>
+                <w:sz w:val="17"/>
+                <w:szCs w:val="17"/>
+              </w:rPr>
+              <w:t>Orden "Pago rechazado", stock intacto y carrito conservado.</w:t>
             </w:r>
           </w:p>
         </w:tc>
@@ -13079,7 +13231,7 @@
                 <w:sz w:val="17"/>
                 <w:szCs w:val="17"/>
               </w:rPr>
-              <w:t xml:space="preserve">R.11</w:t>
+              <w:t>R.9</w:t>
             </w:r>
           </w:p>
         </w:tc>
@@ -13109,24 +13261,7 @@
                 <w:sz w:val="17"/>
                 <w:szCs w:val="17"/>
               </w:rPr>
-              <w:t xml:space="preserve">7 · FormularioLogin (</w:t>
-            </w:r>
-            <w:r>
-              <w:rPr>
-                <w:rFonts w:ascii="Consolas" w:cs="Consolas" w:eastAsia="Consolas" w:hAnsi="Consolas"/>
-                <w:sz w:val="17"/>
-                <w:szCs w:val="17"/>
-                <w:shd w:fill="EFEFEF" w:val="clear"/>
-              </w:rPr>
-              <w:t xml:space="preserve">componentes.spec</w:t>
-            </w:r>
-            <w:r>
-              <w:rPr>
-                <w:rFonts w:ascii="Arial" w:cs="Arial" w:eastAsia="Arial" w:hAnsi="Arial"/>
-                <w:sz w:val="17"/>
-                <w:szCs w:val="17"/>
-              </w:rPr>
-              <w:t xml:space="preserve">)</w:t>
+              <w:t>12 · Compra aprobada</w:t>
             </w:r>
           </w:p>
         </w:tc>
@@ -13156,7 +13291,7 @@
                 <w:sz w:val="17"/>
                 <w:szCs w:val="17"/>
               </w:rPr>
-              <w:t xml:space="preserve">Errores de validación en tiempo real al escribir.</w:t>
+              <w:t>Se muestra la boleta y se descuentan los cupos.</w:t>
             </w:r>
           </w:p>
         </w:tc>
@@ -13174,25 +13309,24 @@
               <w:bottom w:val="single" w:color="BFBFBF" w:sz="4"/>
               <w:right w:val="single" w:color="BFBFBF" w:sz="4"/>
             </w:tcBorders>
-            <w:shd w:fill="FAFAFA" w:val="clear"/>
-            <w:tcMar>
-              <w:top w:type="dxa" w:w="60"/>
-              <w:left w:type="dxa" w:w="100"/>
-              <w:bottom w:type="dxa" w:w="60"/>
-              <w:right w:type="dxa" w:w="100"/>
-            </w:tcMar>
-          </w:tcPr>
-          <w:p>
-            <w:pPr>
-              <w:spacing w:after="20" w:line="252"/>
-            </w:pPr>
-            <w:r>
-              <w:rPr>
-                <w:rFonts w:ascii="Arial" w:cs="Arial" w:eastAsia="Arial" w:hAnsi="Arial"/>
-                <w:sz w:val="17"/>
-                <w:szCs w:val="17"/>
-              </w:rPr>
-              <w:t xml:space="preserve">R.20</w:t>
+            <w:tcMar>
+              <w:top w:type="dxa" w:w="60"/>
+              <w:left w:type="dxa" w:w="100"/>
+              <w:bottom w:type="dxa" w:w="60"/>
+              <w:right w:type="dxa" w:w="100"/>
+            </w:tcMar>
+          </w:tcPr>
+          <w:p>
+            <w:pPr>
+              <w:spacing w:after="20" w:line="252"/>
+            </w:pPr>
+            <w:r>
+              <w:rPr>
+                <w:rFonts w:ascii="Arial" w:cs="Arial" w:eastAsia="Arial" w:hAnsi="Arial"/>
+                <w:sz w:val="17"/>
+                <w:szCs w:val="17"/>
+              </w:rPr>
+              <w:t>R.10</w:t>
             </w:r>
           </w:p>
         </w:tc>
@@ -13205,42 +13339,24 @@
               <w:bottom w:val="single" w:color="BFBFBF" w:sz="4"/>
               <w:right w:val="single" w:color="BFBFBF" w:sz="4"/>
             </w:tcBorders>
-            <w:shd w:fill="FAFAFA" w:val="clear"/>
-            <w:tcMar>
-              <w:top w:type="dxa" w:w="60"/>
-              <w:left w:type="dxa" w:w="100"/>
-              <w:bottom w:type="dxa" w:w="60"/>
-              <w:right w:type="dxa" w:w="100"/>
-            </w:tcMar>
-          </w:tcPr>
-          <w:p>
-            <w:pPr>
-              <w:spacing w:after="20" w:line="252"/>
-            </w:pPr>
-            <w:r>
-              <w:rPr>
-                <w:rFonts w:ascii="Arial" w:cs="Arial" w:eastAsia="Arial" w:hAnsi="Arial"/>
-                <w:sz w:val="17"/>
-                <w:szCs w:val="17"/>
-              </w:rPr>
-              <w:t xml:space="preserve">3 · Stock crítico (</w:t>
-            </w:r>
-            <w:r>
-              <w:rPr>
-                <w:rFonts w:ascii="Consolas" w:cs="Consolas" w:eastAsia="Consolas" w:hAnsi="Consolas"/>
-                <w:sz w:val="17"/>
-                <w:szCs w:val="17"/>
-                <w:shd w:fill="EFEFEF" w:val="clear"/>
-              </w:rPr>
-              <w:t xml:space="preserve">logica.spec</w:t>
-            </w:r>
-            <w:r>
-              <w:rPr>
-                <w:rFonts w:ascii="Arial" w:cs="Arial" w:eastAsia="Arial" w:hAnsi="Arial"/>
-                <w:sz w:val="17"/>
-                <w:szCs w:val="17"/>
-              </w:rPr>
-              <w:t xml:space="preserve">)</w:t>
+            <w:tcMar>
+              <w:top w:type="dxa" w:w="60"/>
+              <w:left w:type="dxa" w:w="100"/>
+              <w:bottom w:type="dxa" w:w="60"/>
+              <w:right w:type="dxa" w:w="100"/>
+            </w:tcMar>
+          </w:tcPr>
+          <w:p>
+            <w:pPr>
+              <w:spacing w:after="20" w:line="252"/>
+            </w:pPr>
+            <w:r>
+              <w:rPr>
+                <w:rFonts w:ascii="Arial" w:cs="Arial" w:eastAsia="Arial" w:hAnsi="Arial"/>
+                <w:sz w:val="17"/>
+                <w:szCs w:val="17"/>
+              </w:rPr>
+              <w:t>9 · validarRun</w:t>
             </w:r>
           </w:p>
         </w:tc>
@@ -13253,25 +13369,24 @@
               <w:bottom w:val="single" w:color="BFBFBF" w:sz="4"/>
               <w:right w:val="single" w:color="BFBFBF" w:sz="4"/>
             </w:tcBorders>
-            <w:shd w:fill="FAFAFA" w:val="clear"/>
-            <w:tcMar>
-              <w:top w:type="dxa" w:w="60"/>
-              <w:left w:type="dxa" w:w="100"/>
-              <w:bottom w:type="dxa" w:w="60"/>
-              <w:right w:type="dxa" w:w="100"/>
-            </w:tcMar>
-          </w:tcPr>
-          <w:p>
-            <w:pPr>
-              <w:spacing w:after="20" w:line="252"/>
-            </w:pPr>
-            <w:r>
-              <w:rPr>
-                <w:rFonts w:ascii="Arial" w:cs="Arial" w:eastAsia="Arial" w:hAnsi="Arial"/>
-                <w:sz w:val="17"/>
-                <w:szCs w:val="17"/>
-              </w:rPr>
-              <w:t xml:space="preserve">Detección con stock igual, menor y mayor que el crítico.</w:t>
+            <w:tcMar>
+              <w:top w:type="dxa" w:w="60"/>
+              <w:left w:type="dxa" w:w="100"/>
+              <w:bottom w:type="dxa" w:w="60"/>
+              <w:right w:type="dxa" w:w="100"/>
+            </w:tcMar>
+          </w:tcPr>
+          <w:p>
+            <w:pPr>
+              <w:spacing w:after="20" w:line="252"/>
+            </w:pPr>
+            <w:r>
+              <w:rPr>
+                <w:rFonts w:ascii="Arial" w:cs="Arial" w:eastAsia="Arial" w:hAnsi="Arial"/>
+                <w:sz w:val="17"/>
+                <w:szCs w:val="17"/>
+              </w:rPr>
+              <w:t>RUN válido aceptado; dígito verificador, largo y vacío rechazados.</w:t>
             </w:r>
           </w:p>
         </w:tc>
@@ -13306,7 +13421,7 @@
                 <w:sz w:val="17"/>
                 <w:szCs w:val="17"/>
               </w:rPr>
-              <w:t xml:space="preserve">R.21</w:t>
+              <w:t>R.11</w:t>
             </w:r>
           </w:p>
         </w:tc>
@@ -13336,24 +13451,7 @@
                 <w:sz w:val="17"/>
                 <w:szCs w:val="17"/>
               </w:rPr>
-              <w:t xml:space="preserve">8 · RutaProtegida (</w:t>
-            </w:r>
-            <w:r>
-              <w:rPr>
-                <w:rFonts w:ascii="Consolas" w:cs="Consolas" w:eastAsia="Consolas" w:hAnsi="Consolas"/>
-                <w:sz w:val="17"/>
-                <w:szCs w:val="17"/>
-                <w:shd w:fill="EFEFEF" w:val="clear"/>
-              </w:rPr>
-              <w:t xml:space="preserve">componentes.spec</w:t>
-            </w:r>
-            <w:r>
-              <w:rPr>
-                <w:rFonts w:ascii="Arial" w:cs="Arial" w:eastAsia="Arial" w:hAnsi="Arial"/>
-                <w:sz w:val="17"/>
-                <w:szCs w:val="17"/>
-              </w:rPr>
-              <w:t xml:space="preserve">)</w:t>
+              <w:t>6 · useFormulario; 7 · FormularioLogin (createSpyObj)</w:t>
             </w:r>
           </w:p>
         </w:tc>
@@ -13383,7 +13481,7 @@
                 <w:sz w:val="17"/>
                 <w:szCs w:val="17"/>
               </w:rPr>
-              <w:t xml:space="preserve">Sin sesión se redirige al login.</w:t>
+              <w:t>Validación en tiempo real y envío al servicio de sesión.</w:t>
             </w:r>
           </w:p>
         </w:tc>
@@ -13401,25 +13499,24 @@
               <w:bottom w:val="single" w:color="BFBFBF" w:sz="4"/>
               <w:right w:val="single" w:color="BFBFBF" w:sz="4"/>
             </w:tcBorders>
-            <w:shd w:fill="FAFAFA" w:val="clear"/>
-            <w:tcMar>
-              <w:top w:type="dxa" w:w="60"/>
-              <w:left w:type="dxa" w:w="100"/>
-              <w:bottom w:type="dxa" w:w="60"/>
-              <w:right w:type="dxa" w:w="100"/>
-            </w:tcMar>
-          </w:tcPr>
-          <w:p>
-            <w:pPr>
-              <w:spacing w:after="20" w:line="252"/>
-            </w:pPr>
-            <w:r>
-              <w:rPr>
-                <w:rFonts w:ascii="Arial" w:cs="Arial" w:eastAsia="Arial" w:hAnsi="Arial"/>
-                <w:sz w:val="17"/>
-                <w:szCs w:val="17"/>
-              </w:rPr>
-              <w:t xml:space="preserve">R.23</w:t>
+            <w:tcMar>
+              <w:top w:type="dxa" w:w="60"/>
+              <w:left w:type="dxa" w:w="100"/>
+              <w:bottom w:type="dxa" w:w="60"/>
+              <w:right w:type="dxa" w:w="100"/>
+            </w:tcMar>
+          </w:tcPr>
+          <w:p>
+            <w:pPr>
+              <w:spacing w:after="20" w:line="252"/>
+            </w:pPr>
+            <w:r>
+              <w:rPr>
+                <w:rFonts w:ascii="Arial" w:cs="Arial" w:eastAsia="Arial" w:hAnsi="Arial"/>
+                <w:sz w:val="17"/>
+                <w:szCs w:val="17"/>
+              </w:rPr>
+              <w:t>R.13</w:t>
             </w:r>
           </w:p>
         </w:tc>
@@ -13432,25 +13529,24 @@
               <w:bottom w:val="single" w:color="BFBFBF" w:sz="4"/>
               <w:right w:val="single" w:color="BFBFBF" w:sz="4"/>
             </w:tcBorders>
-            <w:shd w:fill="FAFAFA" w:val="clear"/>
-            <w:tcMar>
-              <w:top w:type="dxa" w:w="60"/>
-              <w:left w:type="dxa" w:w="100"/>
-              <w:bottom w:type="dxa" w:w="60"/>
-              <w:right w:type="dxa" w:w="100"/>
-            </w:tcMar>
-          </w:tcPr>
-          <w:p>
-            <w:pPr>
-              <w:spacing w:after="20" w:line="252"/>
-            </w:pPr>
-            <w:r>
-              <w:rPr>
-                <w:rFonts w:ascii="Arial" w:cs="Arial" w:eastAsia="Arial" w:hAnsi="Arial"/>
-                <w:sz w:val="17"/>
-                <w:szCs w:val="17"/>
-              </w:rPr>
-              <w:t xml:space="preserve">Las 10 pruebas</w:t>
+            <w:tcMar>
+              <w:top w:type="dxa" w:w="60"/>
+              <w:left w:type="dxa" w:w="100"/>
+              <w:bottom w:type="dxa" w:w="60"/>
+              <w:right w:type="dxa" w:w="100"/>
+            </w:tcMar>
+          </w:tcPr>
+          <w:p>
+            <w:pPr>
+              <w:spacing w:after="20" w:line="252"/>
+            </w:pPr>
+            <w:r>
+              <w:rPr>
+                <w:rFonts w:ascii="Arial" w:cs="Arial" w:eastAsia="Arial" w:hAnsi="Arial"/>
+                <w:sz w:val="17"/>
+                <w:szCs w:val="17"/>
+              </w:rPr>
+              <w:t>2 · CampoFormulario; 4 · FormularioContacto</w:t>
             </w:r>
           </w:p>
         </w:tc>
@@ -13463,25 +13559,404 @@
               <w:bottom w:val="single" w:color="BFBFBF" w:sz="4"/>
               <w:right w:val="single" w:color="BFBFBF" w:sz="4"/>
             </w:tcBorders>
-            <w:shd w:fill="FAFAFA" w:val="clear"/>
-            <w:tcMar>
-              <w:top w:type="dxa" w:w="60"/>
-              <w:left w:type="dxa" w:w="100"/>
-              <w:bottom w:type="dxa" w:w="60"/>
-              <w:right w:type="dxa" w:w="100"/>
-            </w:tcMar>
-          </w:tcPr>
-          <w:p>
-            <w:pPr>
-              <w:spacing w:after="20" w:line="252"/>
-            </w:pPr>
-            <w:r>
-              <w:rPr>
-                <w:rFonts w:ascii="Arial" w:cs="Arial" w:eastAsia="Arial" w:hAnsi="Arial"/>
-                <w:sz w:val="17"/>
-                <w:szCs w:val="17"/>
-              </w:rPr>
-              <w:t xml:space="preserve">10 de 10 exitosas; cobertura reportada en el Documento de cobertura de testing.</w:t>
+            <w:tcMar>
+              <w:top w:type="dxa" w:w="60"/>
+              <w:left w:type="dxa" w:w="100"/>
+              <w:bottom w:type="dxa" w:w="60"/>
+              <w:right w:type="dxa" w:w="100"/>
+            </w:tcMar>
+          </w:tcPr>
+          <w:p>
+            <w:pPr>
+              <w:spacing w:after="20" w:line="252"/>
+            </w:pPr>
+            <w:r>
+              <w:rPr>
+                <w:rFonts w:ascii="Arial" w:cs="Arial" w:eastAsia="Arial" w:hAnsi="Arial"/>
+                <w:sz w:val="17"/>
+                <w:szCs w:val="17"/>
+              </w:rPr>
+              <w:t>El error aparece solo si existe; el estado cambia al escribir.</w:t>
+            </w:r>
+          </w:p>
+        </w:tc>
+      </w:tr>
+      <w:tr>
+        <w:trPr>
+          <w:cantSplit/>
+        </w:trPr>
+        <w:tc>
+          <w:tcPr>
+            <w:tcW w:type="dxa" w:w="1500"/>
+            <w:tcBorders>
+              <w:top w:val="single" w:color="BFBFBF" w:sz="4"/>
+              <w:left w:val="single" w:color="BFBFBF" w:sz="4"/>
+              <w:bottom w:val="single" w:color="BFBFBF" w:sz="4"/>
+              <w:right w:val="single" w:color="BFBFBF" w:sz="4"/>
+            </w:tcBorders>
+            <w:tcMar>
+              <w:top w:type="dxa" w:w="60"/>
+              <w:left w:type="dxa" w:w="100"/>
+              <w:bottom w:type="dxa" w:w="60"/>
+              <w:right w:type="dxa" w:w="100"/>
+            </w:tcMar>
+          </w:tcPr>
+          <w:p>
+            <w:pPr>
+              <w:spacing w:after="20" w:line="252"/>
+            </w:pPr>
+            <w:r>
+              <w:rPr>
+                <w:rFonts w:ascii="Arial" w:cs="Arial" w:eastAsia="Arial" w:hAnsi="Arial"/>
+                <w:sz w:val="17"/>
+                <w:szCs w:val="17"/>
+              </w:rPr>
+              <w:t>R.15 a R.19</w:t>
+            </w:r>
+          </w:p>
+        </w:tc>
+        <w:tc>
+          <w:tcPr>
+            <w:tcW w:type="dxa" w:w="3600"/>
+            <w:tcBorders>
+              <w:top w:val="single" w:color="BFBFBF" w:sz="4"/>
+              <w:left w:val="single" w:color="BFBFBF" w:sz="4"/>
+              <w:bottom w:val="single" w:color="BFBFBF" w:sz="4"/>
+              <w:right w:val="single" w:color="BFBFBF" w:sz="4"/>
+            </w:tcBorders>
+            <w:tcMar>
+              <w:top w:type="dxa" w:w="60"/>
+              <w:left w:type="dxa" w:w="100"/>
+              <w:bottom w:type="dxa" w:w="60"/>
+              <w:right w:type="dxa" w:w="100"/>
+            </w:tcMar>
+          </w:tcPr>
+          <w:p>
+            <w:pPr>
+              <w:spacing w:after="20" w:line="252"/>
+            </w:pPr>
+            <w:r>
+              <w:rPr>
+                <w:rFonts w:ascii="Arial" w:cs="Arial" w:eastAsia="Arial" w:hAnsi="Arial"/>
+                <w:sz w:val="17"/>
+                <w:szCs w:val="17"/>
+              </w:rPr>
+              <w:t>13 · Recorrido de todas las vistas</w:t>
+            </w:r>
+          </w:p>
+        </w:tc>
+        <w:tc>
+          <w:tcPr>
+            <w:tcW w:type="dxa" w:w="4260"/>
+            <w:tcBorders>
+              <w:top w:val="single" w:color="BFBFBF" w:sz="4"/>
+              <w:left w:val="single" w:color="BFBFBF" w:sz="4"/>
+              <w:bottom w:val="single" w:color="BFBFBF" w:sz="4"/>
+              <w:right w:val="single" w:color="BFBFBF" w:sz="4"/>
+            </w:tcBorders>
+            <w:tcMar>
+              <w:top w:type="dxa" w:w="60"/>
+              <w:left w:type="dxa" w:w="100"/>
+              <w:bottom w:type="dxa" w:w="60"/>
+              <w:right w:type="dxa" w:w="100"/>
+            </w:tcMar>
+          </w:tcPr>
+          <w:p>
+            <w:pPr>
+              <w:spacing w:after="20" w:line="252"/>
+            </w:pPr>
+            <w:r>
+              <w:rPr>
+                <w:rFonts w:ascii="Arial" w:cs="Arial" w:eastAsia="Arial" w:hAnsi="Arial"/>
+                <w:sz w:val="17"/>
+                <w:szCs w:val="17"/>
+              </w:rPr>
+              <w:t>Dashboard, órdenes, productos, categorías, usuarios y reportes se dibujan.</w:t>
+            </w:r>
+          </w:p>
+        </w:tc>
+      </w:tr>
+      <w:tr>
+        <w:trPr>
+          <w:cantSplit/>
+        </w:trPr>
+        <w:tc>
+          <w:tcPr>
+            <w:tcW w:type="dxa" w:w="1500"/>
+            <w:tcBorders>
+              <w:top w:val="single" w:color="BFBFBF" w:sz="4"/>
+              <w:left w:val="single" w:color="BFBFBF" w:sz="4"/>
+              <w:bottom w:val="single" w:color="BFBFBF" w:sz="4"/>
+              <w:right w:val="single" w:color="BFBFBF" w:sz="4"/>
+            </w:tcBorders>
+            <w:tcMar>
+              <w:top w:type="dxa" w:w="60"/>
+              <w:left w:type="dxa" w:w="100"/>
+              <w:bottom w:type="dxa" w:w="60"/>
+              <w:right w:type="dxa" w:w="100"/>
+            </w:tcMar>
+          </w:tcPr>
+          <w:p>
+            <w:pPr>
+              <w:spacing w:after="20" w:line="252"/>
+            </w:pPr>
+            <w:r>
+              <w:rPr>
+                <w:rFonts w:ascii="Arial" w:cs="Arial" w:eastAsia="Arial" w:hAnsi="Arial"/>
+                <w:sz w:val="17"/>
+                <w:szCs w:val="17"/>
+              </w:rPr>
+              <w:t>R.21</w:t>
+            </w:r>
+          </w:p>
+        </w:tc>
+        <w:tc>
+          <w:tcPr>
+            <w:tcW w:type="dxa" w:w="3600"/>
+            <w:tcBorders>
+              <w:top w:val="single" w:color="BFBFBF" w:sz="4"/>
+              <w:left w:val="single" w:color="BFBFBF" w:sz="4"/>
+              <w:bottom w:val="single" w:color="BFBFBF" w:sz="4"/>
+              <w:right w:val="single" w:color="BFBFBF" w:sz="4"/>
+            </w:tcBorders>
+            <w:tcMar>
+              <w:top w:type="dxa" w:w="60"/>
+              <w:left w:type="dxa" w:w="100"/>
+              <w:bottom w:type="dxa" w:w="60"/>
+              <w:right w:type="dxa" w:w="100"/>
+            </w:tcMar>
+          </w:tcPr>
+          <w:p>
+            <w:pPr>
+              <w:spacing w:after="20" w:line="252"/>
+            </w:pPr>
+            <w:r>
+              <w:rPr>
+                <w:rFonts w:ascii="Arial" w:cs="Arial" w:eastAsia="Arial" w:hAnsi="Arial"/>
+                <w:sz w:val="17"/>
+                <w:szCs w:val="17"/>
+              </w:rPr>
+              <w:t>10 · RutaProtegida</w:t>
+            </w:r>
+          </w:p>
+        </w:tc>
+        <w:tc>
+          <w:tcPr>
+            <w:tcW w:type="dxa" w:w="4260"/>
+            <w:tcBorders>
+              <w:top w:val="single" w:color="BFBFBF" w:sz="4"/>
+              <w:left w:val="single" w:color="BFBFBF" w:sz="4"/>
+              <w:bottom w:val="single" w:color="BFBFBF" w:sz="4"/>
+              <w:right w:val="single" w:color="BFBFBF" w:sz="4"/>
+            </w:tcBorders>
+            <w:tcMar>
+              <w:top w:type="dxa" w:w="60"/>
+              <w:left w:type="dxa" w:w="100"/>
+              <w:bottom w:type="dxa" w:w="60"/>
+              <w:right w:type="dxa" w:w="100"/>
+            </w:tcMar>
+          </w:tcPr>
+          <w:p>
+            <w:pPr>
+              <w:spacing w:after="20" w:line="252"/>
+            </w:pPr>
+            <w:r>
+              <w:rPr>
+                <w:rFonts w:ascii="Arial" w:cs="Arial" w:eastAsia="Arial" w:hAnsi="Arial"/>
+                <w:sz w:val="17"/>
+                <w:szCs w:val="17"/>
+              </w:rPr>
+              <w:t>Sin sesión va al login; con un rol sin permiso, al inicio.</w:t>
+            </w:r>
+          </w:p>
+        </w:tc>
+      </w:tr>
+      <w:tr>
+        <w:trPr>
+          <w:cantSplit/>
+        </w:trPr>
+        <w:tc>
+          <w:tcPr>
+            <w:tcW w:type="dxa" w:w="1500"/>
+            <w:tcBorders>
+              <w:top w:val="single" w:color="BFBFBF" w:sz="4"/>
+              <w:left w:val="single" w:color="BFBFBF" w:sz="4"/>
+              <w:bottom w:val="single" w:color="BFBFBF" w:sz="4"/>
+              <w:right w:val="single" w:color="BFBFBF" w:sz="4"/>
+            </w:tcBorders>
+            <w:tcMar>
+              <w:top w:type="dxa" w:w="60"/>
+              <w:left w:type="dxa" w:w="100"/>
+              <w:bottom w:type="dxa" w:w="60"/>
+              <w:right w:type="dxa" w:w="100"/>
+            </w:tcMar>
+          </w:tcPr>
+          <w:p>
+            <w:pPr>
+              <w:spacing w:after="20" w:line="252"/>
+            </w:pPr>
+            <w:r>
+              <w:rPr>
+                <w:rFonts w:ascii="Arial" w:cs="Arial" w:eastAsia="Arial" w:hAnsi="Arial"/>
+                <w:sz w:val="17"/>
+                <w:szCs w:val="17"/>
+              </w:rPr>
+              <w:t>R.22</w:t>
+            </w:r>
+          </w:p>
+        </w:tc>
+        <w:tc>
+          <w:tcPr>
+            <w:tcW w:type="dxa" w:w="3600"/>
+            <w:tcBorders>
+              <w:top w:val="single" w:color="BFBFBF" w:sz="4"/>
+              <w:left w:val="single" w:color="BFBFBF" w:sz="4"/>
+              <w:bottom w:val="single" w:color="BFBFBF" w:sz="4"/>
+              <w:right w:val="single" w:color="BFBFBF" w:sz="4"/>
+            </w:tcBorders>
+            <w:tcMar>
+              <w:top w:type="dxa" w:w="60"/>
+              <w:left w:type="dxa" w:w="100"/>
+              <w:bottom w:type="dxa" w:w="60"/>
+              <w:right w:type="dxa" w:w="100"/>
+            </w:tcMar>
+          </w:tcPr>
+          <w:p>
+            <w:pPr>
+              <w:spacing w:after="20" w:line="252"/>
+            </w:pPr>
+            <w:r>
+              <w:rPr>
+                <w:rFonts w:ascii="Arial" w:cs="Arial" w:eastAsia="Arial" w:hAnsi="Arial"/>
+                <w:sz w:val="17"/>
+                <w:szCs w:val="17"/>
+              </w:rPr>
+              <w:t>11 · CRUD de db.js</w:t>
+            </w:r>
+          </w:p>
+        </w:tc>
+        <w:tc>
+          <w:tcPr>
+            <w:tcW w:type="dxa" w:w="4260"/>
+            <w:tcBorders>
+              <w:top w:val="single" w:color="BFBFBF" w:sz="4"/>
+              <w:left w:val="single" w:color="BFBFBF" w:sz="4"/>
+              <w:bottom w:val="single" w:color="BFBFBF" w:sz="4"/>
+              <w:right w:val="single" w:color="BFBFBF" w:sz="4"/>
+            </w:tcBorders>
+            <w:tcMar>
+              <w:top w:type="dxa" w:w="60"/>
+              <w:left w:type="dxa" w:w="100"/>
+              <w:bottom w:type="dxa" w:w="60"/>
+              <w:right w:type="dxa" w:w="100"/>
+            </w:tcMar>
+          </w:tcPr>
+          <w:p>
+            <w:pPr>
+              <w:spacing w:after="20" w:line="252"/>
+            </w:pPr>
+            <w:r>
+              <w:rPr>
+                <w:rFonts w:ascii="Arial" w:cs="Arial" w:eastAsia="Arial" w:hAnsi="Arial"/>
+                <w:sz w:val="17"/>
+                <w:szCs w:val="17"/>
+              </w:rPr>
+              <w:t>Crear, leer, actualizar y eliminar registros, incluidos casos límite.</w:t>
+            </w:r>
+          </w:p>
+        </w:tc>
+      </w:tr>
+      <w:tr>
+        <w:trPr>
+          <w:cantSplit/>
+        </w:trPr>
+        <w:tc>
+          <w:tcPr>
+            <w:tcW w:type="dxa" w:w="1500"/>
+            <w:tcBorders>
+              <w:top w:val="single" w:color="BFBFBF" w:sz="4"/>
+              <w:left w:val="single" w:color="BFBFBF" w:sz="4"/>
+              <w:bottom w:val="single" w:color="BFBFBF" w:sz="4"/>
+              <w:right w:val="single" w:color="BFBFBF" w:sz="4"/>
+            </w:tcBorders>
+            <w:tcMar>
+              <w:top w:type="dxa" w:w="60"/>
+              <w:left w:type="dxa" w:w="100"/>
+              <w:bottom w:type="dxa" w:w="60"/>
+              <w:right w:type="dxa" w:w="100"/>
+            </w:tcMar>
+          </w:tcPr>
+          <w:p>
+            <w:pPr>
+              <w:spacing w:after="20" w:line="252"/>
+            </w:pPr>
+            <w:r>
+              <w:rPr>
+                <w:rFonts w:ascii="Arial" w:cs="Arial" w:eastAsia="Arial" w:hAnsi="Arial"/>
+                <w:sz w:val="17"/>
+                <w:szCs w:val="17"/>
+              </w:rPr>
+              <w:t>R.23</w:t>
+            </w:r>
+          </w:p>
+        </w:tc>
+        <w:tc>
+          <w:tcPr>
+            <w:tcW w:type="dxa" w:w="3600"/>
+            <w:tcBorders>
+              <w:top w:val="single" w:color="BFBFBF" w:sz="4"/>
+              <w:left w:val="single" w:color="BFBFBF" w:sz="4"/>
+              <w:bottom w:val="single" w:color="BFBFBF" w:sz="4"/>
+              <w:right w:val="single" w:color="BFBFBF" w:sz="4"/>
+            </w:tcBorders>
+            <w:tcMar>
+              <w:top w:type="dxa" w:w="60"/>
+              <w:left w:type="dxa" w:w="100"/>
+              <w:bottom w:type="dxa" w:w="60"/>
+              <w:right w:type="dxa" w:w="100"/>
+            </w:tcMar>
+          </w:tcPr>
+          <w:p>
+            <w:pPr>
+              <w:spacing w:after="20" w:line="252"/>
+            </w:pPr>
+            <w:r>
+              <w:rPr>
+                <w:rFonts w:ascii="Arial" w:cs="Arial" w:eastAsia="Arial" w:hAnsi="Arial"/>
+                <w:sz w:val="17"/>
+                <w:szCs w:val="17"/>
+              </w:rPr>
+              <w:t>Las 15 pruebas; 14 · XSS; 15 · Error Boundary</w:t>
+            </w:r>
+          </w:p>
+        </w:tc>
+        <w:tc>
+          <w:tcPr>
+            <w:tcW w:type="dxa" w:w="4260"/>
+            <w:tcBorders>
+              <w:top w:val="single" w:color="BFBFBF" w:sz="4"/>
+              <w:left w:val="single" w:color="BFBFBF" w:sz="4"/>
+              <w:bottom w:val="single" w:color="BFBFBF" w:sz="4"/>
+              <w:right w:val="single" w:color="BFBFBF" w:sz="4"/>
+            </w:tcBorders>
+            <w:tcMar>
+              <w:top w:type="dxa" w:w="60"/>
+              <w:left w:type="dxa" w:w="100"/>
+              <w:bottom w:type="dxa" w:w="60"/>
+              <w:right w:type="dxa" w:w="100"/>
+            </w:tcMar>
+          </w:tcPr>
+          <w:p>
+            <w:pPr>
+              <w:spacing w:after="20" w:line="252"/>
+            </w:pPr>
+            <w:r>
+              <w:rPr>
+                <w:rFonts w:ascii="Arial" w:cs="Arial" w:eastAsia="Arial" w:hAnsi="Arial"/>
+                <w:sz w:val="17"/>
+                <w:szCs w:val="17"/>
+              </w:rPr>
+              <w:t>15 de 15 exitosas; cobertura en el Documento de cobertura de testing.</w:t>
             </w:r>
           </w:p>
         </w:tc>
@@ -13495,12 +13970,13 @@
         <w:rPr>
           <w:rFonts w:ascii="Arial" w:cs="Arial" w:eastAsia="Arial" w:hAnsi="Arial"/>
         </w:rPr>
-        <w:t xml:space="preserve">Los requisitos sin prueba automática (por ejemplo el panel de administración, R.15 a R.19) se verificaron manualmente y quedan como mejora para la siguiente versión.</w:t>
+        <w:t>Las vistas del panel (R.15 a R.19) se recorren en la prueba 13. La edición de productos, categorías y usuarios desde sus formularios se verificó manualmente y queda como mejora para la siguiente versión.</w:t>
       </w:r>
     </w:p>
     <w:sectPr>
       <w:headerReference w:type="default" r:id="rId7"/>
       <w:footerReference w:type="default" r:id="rId8"/>
+      <w:headerReference w:type="first" r:id="rId10"/>
       <w:pgSz w:w="12240" w:h="15840" w:orient="portrait"/>
       <w:pgMar w:top="1300" w:right="1440" w:bottom="1200" w:left="1440" w:header="708" w:footer="708" w:gutter="0"/>
       <w:pgNumType/>
@@ -13656,8 +14132,18 @@
         <w:sz w:val="16"/>
         <w:szCs w:val="16"/>
       </w:rPr>
-      <w:t xml:space="preserve">Forever Ink · Especificación de Requisitos de Software · v2.0</w:t>
+      <w:t>Forever Ink · Especificación de Requisitos de Software · v2.1</w:t>
     </w:r>
+  </w:p>
+</w:hdr>
+</file>
+
+<file path=word/header2.xml><?xml version="1.0" encoding="utf-8"?>
+<w:hdr xmlns:m="http://schemas.openxmlformats.org/officeDocument/2006/math" xmlns:mc="http://schemas.openxmlformats.org/markup-compatibility/2006" xmlns:mo="http://schemas.microsoft.com/office/mac/office/2008/main" xmlns:mv="urn:schemas-microsoft-com:mac:vml" xmlns:o="urn:schemas-microsoft-com:office:office" xmlns:r="http://schemas.openxmlformats.org/officeDocument/2006/relationships" xmlns:v="urn:schemas-microsoft-com:vml" xmlns:w10="urn:schemas-microsoft-com:office:word" xmlns:w14="http://schemas.microsoft.com/office/word/2010/wordml" xmlns:w="http://schemas.openxmlformats.org/wordprocessingml/2006/main" xmlns:wne="http://schemas.microsoft.com/office/word/2006/wordml" xmlns:wp14="http://schemas.microsoft.com/office/word/2010/wordprocessingDrawing" xmlns:wp="http://schemas.openxmlformats.org/drawingml/2006/wordprocessingDrawing" xmlns:wpc="http://schemas.microsoft.com/office/word/2010/wordprocessingCanvas" xmlns:wpg="http://schemas.microsoft.com/office/word/2010/wordprocessingGroup" xmlns:wpi="http://schemas.microsoft.com/office/word/2010/wordprocessingInk" xmlns:wps="http://schemas.microsoft.com/office/word/2010/wordprocessingShape" mc:Ignorable="w14 wp14">
+  <w:p>
+    <w:pPr>
+      <w:pStyle w:val="Header"/>
+    </w:pPr>
   </w:p>
 </w:hdr>
 </file>

</xml_diff>

<commit_message>
Equipo de tres: Isabel Cántaro, Eduardo Caro y Yeremi Vásquez, con reparto de responsabilidades
- Página Nosotros, README, index.html y package.json con los tres integrantes
- ERS 2.1: equipo, historial y reparto en "Otros requisitos"
- Guía de defensa (sección 1.1) y plan de 2 días con quién lidera cada parte y cada prueba

Co-Authored-By: Claude Opus 5.5 <noreply@anthropic.com>
Claude-Session: https://claude.ai/code/session_01Pt6gjuLf4CGXtN9zPMw67H
</commit_message>
<xml_diff>
--- a/docs/ERS_ForeverInk_v2.docx
+++ b/docs/ERS_ForeverInk_v2.docx
@@ -153,7 +153,7 @@
           <w:sz w:val="20"/>
           <w:szCs w:val="20"/>
         </w:rPr>
-        <w:t>Equipo: Isabel Cántaro</w:t>
+        <w:t>Equipo: Isabel Cántaro · Eduardo Caro · Yeremi Vásquez</w:t>
       </w:r>
     </w:p>
     <w:p>
@@ -792,7 +792,7 @@
                 <w:sz w:val="19"/>
                 <w:szCs w:val="19"/>
               </w:rPr>
-              <w:t>Isabel Cántaro</w:t>
+              <w:t>Isabel Cántaro / Eduardo Caro / Yeremi Vásquez</w:t>
             </w:r>
           </w:p>
         </w:tc>
@@ -823,7 +823,7 @@
                 <w:sz w:val="19"/>
                 <w:szCs w:val="19"/>
               </w:rPr>
-              <w:t>Adaptación al material de la asignatura: componentes con Atomic Design, estado compartido en App entregado por props, BrowserRouter, imágenes importadas desde src/assets, Google Fonts, hoja de estilos en formato estándar con tabla de contenido y enfoque mobile first, Error Boundary, carga diferida del panel y 15 pruebas (10 de defensa y 5 complementarias). El equipo queda conformado por Isabel Cántaro.</w:t>
+              <w:t>Adaptación al material de la asignatura: componentes con Atomic Design, estado compartido en App entregado por props, BrowserRouter, imágenes importadas desde src/assets, Google Fonts, hoja de estilos en formato estándar con tabla de contenido y enfoque mobile first, Error Boundary, carga diferida del panel y 15 pruebas (10 de defensa y 5 complementarias). El equipo queda conformado por Isabel Cántaro, Eduardo Caro y Yeremi Vásquez.</w:t>
             </w:r>
           </w:p>
         </w:tc>
@@ -4466,7 +4466,7 @@
         <w:rPr>
           <w:rFonts w:ascii="Arial" w:cs="Arial" w:eastAsia="Arial" w:hAnsi="Arial"/>
         </w:rPr>
-        <w:t>El proyecto se desarrolla en equipo (máximo 3 integrantes); en esta entrega el equipo está conformado por 1 integrante (Isabel Cántaro).</w:t>
+        <w:t>El proyecto se desarrolla en equipo (máximo 3 integrantes); este equipo es de 3 integrantes: Isabel Cántaro, Eduardo Caro y Yeremi Vásquez.</w:t>
       </w:r>
     </w:p>
     <w:p>
@@ -12417,6 +12417,22 @@
           <w:rFonts w:ascii="Arial" w:cs="Arial" w:eastAsia="Arial" w:hAnsi="Arial"/>
         </w:rPr>
         <w:t xml:space="preserve">El equipo debe estar en condiciones de presentar el desarrollo funcional del sitio y de responder preguntas abiertas sobre las decisiones técnicas tomadas, de forma individual.</w:t>
+      </w:r>
+    </w:p>
+    <w:p>
+      <w:pPr>
+        <w:pStyle w:val="ListParagraph"/>
+        <w:numPr>
+          <w:ilvl w:val="0"/>
+          <w:numId w:val="2"/>
+        </w:numPr>
+        <w:spacing w:after="60" w:line="276"/>
+      </w:pPr>
+      <w:r>
+        <w:rPr>
+          <w:rFonts w:ascii="Arial" w:cs="Arial" w:eastAsia="Arial" w:hAnsi="Arial"/>
+        </w:rPr>
+        <w:t>Reparto de responsabilidades: Isabel Cántaro lidera el módulo Tienda (catálogo, carrito, checkout con agenda, pago y boleta); Eduardo Caro lidera usuarios, sesión, roles y el panel de administración; Yeremi Vásquez lidera el diseño (componentes con Atomic Design y estilos responsivos), la base de datos simulada y la configuración de las pruebas. Cada integrante debe poder explicar el proyecto completo.</w:t>
       </w:r>
     </w:p>
     <w:p>

</xml_diff>